<commit_message>
feat: convert_episodes 并行 --num-workers；扩展 md-to-docx 与报告 skills
- ProcessPoolExecutor 并行转换 episode，CLI 新增 --num-workers，dataset_info 记录 worker 数
- md-to-docx-report：LaTeX→OMML、黑底白字代码块、Mermaid→PNG（§17–19）及 mermaid_to_png.py
- 新增 docx-to-md、hik_report、pdf-to-md Cursor skills；重出 SAM2Grasp 中英 docx/md
- 添加 compare_pose_offline 离线位姿对比脚本与 Level-up 扫描报告
</commit_message>
<xml_diff>
--- a/docs/sam2grasp_zh_en.docx
+++ b/docs/sam2grasp_zh_en.docx
@@ -1571,15 +1571,14 @@
         </w:rPr>
         <w:t xml:space="preserve"> Standard Behavioral Cloning (BC) aims to learn a policy </w:t>
       </w:r>
-      <w:r>
-        <w:rPr>
-          <w:rFonts w:ascii="Times New Roman" w:hAnsi="Times New Roman" w:eastAsia="宋体"/>
-          <w:b w:val="0"/>
-          <w:i/>
-          <w:sz w:val="24"/>
-        </w:rPr>
-        <w:t>\pi</w:t>
-      </w:r>
+      <m:oMath>
+        <m:r>
+          <m:rPr>
+            <m:sty m:val="p"/>
+          </m:rPr>
+          <m:t xml:space="preserve">π</m:t>
+        </m:r>
+      </m:oMath>
       <w:r>
         <w:rPr>
           <w:rFonts w:ascii="Times New Roman" w:hAnsi="Times New Roman" w:eastAsia="宋体"/>
@@ -1589,15 +1588,26 @@
         </w:rPr>
         <w:t xml:space="preserve"> that minimizes a loss function between its predicted action </w:t>
       </w:r>
-      <w:r>
-        <w:rPr>
-          <w:rFonts w:ascii="Times New Roman" w:hAnsi="Times New Roman" w:eastAsia="宋体"/>
-          <w:b w:val="0"/>
-          <w:i/>
-          <w:sz w:val="24"/>
-        </w:rPr>
-        <w:t>a_t</w:t>
-      </w:r>
+      <m:oMath>
+        <m:sSub>
+          <m:e>
+            <m:r>
+              <m:rPr>
+                <m:sty m:val="i"/>
+              </m:rPr>
+              <m:t xml:space="preserve">a</m:t>
+            </m:r>
+          </m:e>
+          <m:sub>
+            <m:r>
+              <m:rPr>
+                <m:sty m:val="i"/>
+              </m:rPr>
+              <m:t xml:space="preserve">t</m:t>
+            </m:r>
+          </m:sub>
+        </m:sSub>
+      </m:oMath>
       <w:r>
         <w:rPr>
           <w:rFonts w:ascii="Times New Roman" w:hAnsi="Times New Roman" w:eastAsia="宋体"/>
@@ -1607,15 +1617,34 @@
         </w:rPr>
         <w:t xml:space="preserve"> and an expert’s action </w:t>
       </w:r>
-      <w:r>
-        <w:rPr>
-          <w:rFonts w:ascii="Times New Roman" w:hAnsi="Times New Roman" w:eastAsia="宋体"/>
-          <w:b w:val="0"/>
-          <w:i/>
-          <w:sz w:val="24"/>
-        </w:rPr>
-        <w:t>a^*_t</w:t>
-      </w:r>
+      <m:oMath>
+        <m:sSubSup>
+          <m:e>
+            <m:r>
+              <m:rPr>
+                <m:sty m:val="i"/>
+              </m:rPr>
+              <m:t xml:space="preserve">a</m:t>
+            </m:r>
+          </m:e>
+          <m:sub>
+            <m:r>
+              <m:rPr>
+                <m:sty m:val="i"/>
+              </m:rPr>
+              <m:t xml:space="preserve">t</m:t>
+            </m:r>
+          </m:sub>
+          <m:sup>
+            <m:r>
+              <m:rPr>
+                <m:sty m:val="p"/>
+              </m:rPr>
+              <m:t xml:space="preserve">*</m:t>
+            </m:r>
+          </m:sup>
+        </m:sSubSup>
+      </m:oMath>
       <w:r>
         <w:rPr>
           <w:rFonts w:ascii="Times New Roman" w:hAnsi="Times New Roman" w:eastAsia="宋体"/>
@@ -1625,15 +1654,94 @@
         </w:rPr>
         <w:t xml:space="preserve"> from a demonstration dataset </w:t>
       </w:r>
-      <w:r>
-        <w:rPr>
-          <w:rFonts w:ascii="Times New Roman" w:hAnsi="Times New Roman" w:eastAsia="宋体"/>
-          <w:b w:val="0"/>
-          <w:i/>
-          <w:sz w:val="24"/>
-        </w:rPr>
-        <w:t>D = (s_t, a^*_t)</w:t>
-      </w:r>
+      <m:oMath>
+        <m:r>
+          <m:rPr>
+            <m:sty m:val="i"/>
+          </m:rPr>
+          <m:t xml:space="preserve">D</m:t>
+        </m:r>
+        <m:r>
+          <m:rPr>
+            <m:sty m:val="p"/>
+          </m:rPr>
+          <m:t xml:space="preserve"> </m:t>
+        </m:r>
+        <m:r>
+          <m:rPr>
+            <m:sty m:val="p"/>
+          </m:rPr>
+          <m:t xml:space="preserve">=</m:t>
+        </m:r>
+        <m:r>
+          <m:rPr>
+            <m:sty m:val="p"/>
+          </m:rPr>
+          <m:t xml:space="preserve"> </m:t>
+        </m:r>
+        <m:r>
+          <m:rPr>
+            <m:sty m:val="p"/>
+          </m:rPr>
+          <m:t xml:space="preserve">(</m:t>
+        </m:r>
+        <m:sSub>
+          <m:e>
+            <m:r>
+              <m:rPr>
+                <m:sty m:val="i"/>
+              </m:rPr>
+              <m:t xml:space="preserve">s</m:t>
+            </m:r>
+          </m:e>
+          <m:sub>
+            <m:r>
+              <m:rPr>
+                <m:sty m:val="i"/>
+              </m:rPr>
+              <m:t xml:space="preserve">t</m:t>
+            </m:r>
+          </m:sub>
+        </m:sSub>
+        <m:r>
+          <m:rPr>
+            <m:sty m:val="p"/>
+          </m:rPr>
+          <m:t xml:space="preserve">,</m:t>
+        </m:r>
+        <m:r>
+          <m:rPr>
+            <m:sty m:val="p"/>
+          </m:rPr>
+          <m:t xml:space="preserve"> </m:t>
+        </m:r>
+        <m:sSubSup>
+          <m:e>
+            <m:r>
+              <m:rPr>
+                <m:sty m:val="i"/>
+              </m:rPr>
+              <m:t xml:space="preserve">a</m:t>
+            </m:r>
+          </m:e>
+          <m:sub>
+            <m:r>
+              <m:rPr>
+                <m:sty m:val="i"/>
+              </m:rPr>
+              <m:t xml:space="preserve">t</m:t>
+            </m:r>
+          </m:sub>
+          <m:sup>
+            <m:r>
+              <m:rPr>
+                <m:sty m:val="p"/>
+              </m:rPr>
+              <m:t xml:space="preserve">*</m:t>
+            </m:r>
+          </m:sup>
+        </m:sSubSup>
+      </m:oMath>
       <w:r>
         <w:rPr>
           <w:rFonts w:ascii="Times New Roman" w:hAnsi="Times New Roman" w:eastAsia="宋体"/>
@@ -1667,15 +1775,14 @@
         </w:rPr>
         <w:t xml:space="preserve"> 标准行为克隆（BC）希望学策略 </w:t>
       </w:r>
-      <w:r>
-        <w:rPr>
-          <w:rFonts w:ascii="Times New Roman" w:hAnsi="Times New Roman" w:eastAsia="宋体"/>
-          <w:b w:val="0"/>
-          <w:i/>
-          <w:sz w:val="24"/>
-        </w:rPr>
-        <w:t>\pi</w:t>
-      </w:r>
+      <m:oMath>
+        <m:r>
+          <m:rPr>
+            <m:sty m:val="p"/>
+          </m:rPr>
+          <m:t xml:space="preserve">π</m:t>
+        </m:r>
+      </m:oMath>
       <w:r>
         <w:rPr>
           <w:rFonts w:ascii="Times New Roman" w:hAnsi="Times New Roman" w:eastAsia="宋体"/>
@@ -1685,15 +1792,26 @@
         </w:rPr>
         <w:t xml:space="preserve">，使预测动作 </w:t>
       </w:r>
-      <w:r>
-        <w:rPr>
-          <w:rFonts w:ascii="Times New Roman" w:hAnsi="Times New Roman" w:eastAsia="宋体"/>
-          <w:b w:val="0"/>
-          <w:i/>
-          <w:sz w:val="24"/>
-        </w:rPr>
-        <w:t>a_t</w:t>
-      </w:r>
+      <m:oMath>
+        <m:sSub>
+          <m:e>
+            <m:r>
+              <m:rPr>
+                <m:sty m:val="i"/>
+              </m:rPr>
+              <m:t xml:space="preserve">a</m:t>
+            </m:r>
+          </m:e>
+          <m:sub>
+            <m:r>
+              <m:rPr>
+                <m:sty m:val="i"/>
+              </m:rPr>
+              <m:t xml:space="preserve">t</m:t>
+            </m:r>
+          </m:sub>
+        </m:sSub>
+      </m:oMath>
       <w:r>
         <w:rPr>
           <w:rFonts w:ascii="Times New Roman" w:hAnsi="Times New Roman" w:eastAsia="宋体"/>
@@ -1703,15 +1821,76 @@
         </w:rPr>
         <w:t xml:space="preserve"> 与演示数据集 </w:t>
       </w:r>
-      <w:r>
-        <w:rPr>
-          <w:rFonts w:ascii="Times New Roman" w:hAnsi="Times New Roman" w:eastAsia="宋体"/>
-          <w:b w:val="0"/>
-          <w:i/>
-          <w:sz w:val="24"/>
-        </w:rPr>
-        <w:t>D=(s_t,a^*_t)</w:t>
-      </w:r>
+      <m:oMath>
+        <m:r>
+          <m:rPr>
+            <m:sty m:val="i"/>
+          </m:rPr>
+          <m:t xml:space="preserve">D</m:t>
+        </m:r>
+        <m:r>
+          <m:rPr>
+            <m:sty m:val="p"/>
+          </m:rPr>
+          <m:t xml:space="preserve">=</m:t>
+        </m:r>
+        <m:r>
+          <m:rPr>
+            <m:sty m:val="p"/>
+          </m:rPr>
+          <m:t xml:space="preserve">(</m:t>
+        </m:r>
+        <m:sSub>
+          <m:e>
+            <m:r>
+              <m:rPr>
+                <m:sty m:val="i"/>
+              </m:rPr>
+              <m:t xml:space="preserve">s</m:t>
+            </m:r>
+          </m:e>
+          <m:sub>
+            <m:r>
+              <m:rPr>
+                <m:sty m:val="i"/>
+              </m:rPr>
+              <m:t xml:space="preserve">t</m:t>
+            </m:r>
+          </m:sub>
+        </m:sSub>
+        <m:r>
+          <m:rPr>
+            <m:sty m:val="p"/>
+          </m:rPr>
+          <m:t xml:space="preserve">,</m:t>
+        </m:r>
+        <m:sSubSup>
+          <m:e>
+            <m:r>
+              <m:rPr>
+                <m:sty m:val="i"/>
+              </m:rPr>
+              <m:t xml:space="preserve">a</m:t>
+            </m:r>
+          </m:e>
+          <m:sub>
+            <m:r>
+              <m:rPr>
+                <m:sty m:val="i"/>
+              </m:rPr>
+              <m:t xml:space="preserve">t</m:t>
+            </m:r>
+          </m:sub>
+          <m:sup>
+            <m:r>
+              <m:rPr>
+                <m:sty m:val="p"/>
+              </m:rPr>
+              <m:t xml:space="preserve">*</m:t>
+            </m:r>
+          </m:sup>
+        </m:sSubSup>
+      </m:oMath>
       <w:r>
         <w:rPr>
           <w:rFonts w:ascii="Times New Roman" w:hAnsi="Times New Roman" w:eastAsia="宋体"/>
@@ -1721,15 +1900,34 @@
         </w:rPr>
         <w:t xml:space="preserve"> 中专家动作 </w:t>
       </w:r>
-      <w:r>
-        <w:rPr>
-          <w:rFonts w:ascii="Times New Roman" w:hAnsi="Times New Roman" w:eastAsia="宋体"/>
-          <w:b w:val="0"/>
-          <w:i/>
-          <w:sz w:val="24"/>
-        </w:rPr>
-        <w:t>a^*_t</w:t>
-      </w:r>
+      <m:oMath>
+        <m:sSubSup>
+          <m:e>
+            <m:r>
+              <m:rPr>
+                <m:sty m:val="i"/>
+              </m:rPr>
+              <m:t xml:space="preserve">a</m:t>
+            </m:r>
+          </m:e>
+          <m:sub>
+            <m:r>
+              <m:rPr>
+                <m:sty m:val="i"/>
+              </m:rPr>
+              <m:t xml:space="preserve">t</m:t>
+            </m:r>
+          </m:sub>
+          <m:sup>
+            <m:r>
+              <m:rPr>
+                <m:sty m:val="p"/>
+              </m:rPr>
+              <m:t xml:space="preserve">*</m:t>
+            </m:r>
+          </m:sup>
+        </m:sSubSup>
+      </m:oMath>
       <w:r>
         <w:rPr>
           <w:rFonts w:ascii="Times New Roman" w:hAnsi="Times New Roman" w:eastAsia="宋体"/>
@@ -1796,15 +1994,76 @@
         </w:rPr>
         <w:t xml:space="preserve"> Given multiple graspable objects, which one should be the target? Demonstrations where experts grasp different objects from the same initial scene create conflicting data pairs </w:t>
       </w:r>
-      <w:r>
-        <w:rPr>
-          <w:rFonts w:ascii="Times New Roman" w:hAnsi="Times New Roman" w:eastAsia="宋体"/>
-          <w:b w:val="0"/>
-          <w:i/>
-          <w:sz w:val="24"/>
-        </w:rPr>
-        <w:t>(s_t, a^*_{t,1})</w:t>
-      </w:r>
+      <m:oMath>
+        <m:r>
+          <m:rPr>
+            <m:sty m:val="p"/>
+          </m:rPr>
+          <m:t xml:space="preserve">(</m:t>
+        </m:r>
+        <m:sSub>
+          <m:e>
+            <m:r>
+              <m:rPr>
+                <m:sty m:val="i"/>
+              </m:rPr>
+              <m:t xml:space="preserve">s</m:t>
+            </m:r>
+          </m:e>
+          <m:sub>
+            <m:r>
+              <m:rPr>
+                <m:sty m:val="i"/>
+              </m:rPr>
+              <m:t xml:space="preserve">t</m:t>
+            </m:r>
+          </m:sub>
+        </m:sSub>
+        <m:r>
+          <m:rPr>
+            <m:sty m:val="p"/>
+          </m:rPr>
+          <m:t xml:space="preserve">,</m:t>
+        </m:r>
+        <m:r>
+          <m:rPr>
+            <m:sty m:val="p"/>
+          </m:rPr>
+          <m:t xml:space="preserve"> </m:t>
+        </m:r>
+        <m:sSubSup>
+          <m:e>
+            <m:r>
+              <m:rPr>
+                <m:sty m:val="i"/>
+              </m:rPr>
+              <m:t xml:space="preserve">a</m:t>
+            </m:r>
+          </m:e>
+          <m:sub>
+            <m:r>
+              <m:rPr>
+                <m:sty m:val="i"/>
+              </m:rPr>
+              <m:t xml:space="preserve">t</m:t>
+            </m:r>
+            <m:r>
+              <m:rPr>
+                <m:sty m:val="p"/>
+              </m:rPr>
+              <m:t xml:space="preserve">,1</m:t>
+            </m:r>
+          </m:sub>
+          <m:sup>
+            <m:r>
+              <m:rPr>
+                <m:sty m:val="p"/>
+              </m:rPr>
+              <m:t xml:space="preserve">*</m:t>
+            </m:r>
+          </m:sup>
+        </m:sSubSup>
+      </m:oMath>
       <w:r>
         <w:rPr>
           <w:rFonts w:ascii="Times New Roman" w:hAnsi="Times New Roman" w:eastAsia="宋体"/>
@@ -1814,15 +2073,76 @@
         </w:rPr>
         <w:t xml:space="preserve"> and </w:t>
       </w:r>
-      <w:r>
-        <w:rPr>
-          <w:rFonts w:ascii="Times New Roman" w:hAnsi="Times New Roman" w:eastAsia="宋体"/>
-          <w:b w:val="0"/>
-          <w:i/>
-          <w:sz w:val="24"/>
-        </w:rPr>
-        <w:t>(s_t, a^*_{t,2})</w:t>
-      </w:r>
+      <m:oMath>
+        <m:r>
+          <m:rPr>
+            <m:sty m:val="p"/>
+          </m:rPr>
+          <m:t xml:space="preserve">(</m:t>
+        </m:r>
+        <m:sSub>
+          <m:e>
+            <m:r>
+              <m:rPr>
+                <m:sty m:val="i"/>
+              </m:rPr>
+              <m:t xml:space="preserve">s</m:t>
+            </m:r>
+          </m:e>
+          <m:sub>
+            <m:r>
+              <m:rPr>
+                <m:sty m:val="i"/>
+              </m:rPr>
+              <m:t xml:space="preserve">t</m:t>
+            </m:r>
+          </m:sub>
+        </m:sSub>
+        <m:r>
+          <m:rPr>
+            <m:sty m:val="p"/>
+          </m:rPr>
+          <m:t xml:space="preserve">,</m:t>
+        </m:r>
+        <m:r>
+          <m:rPr>
+            <m:sty m:val="p"/>
+          </m:rPr>
+          <m:t xml:space="preserve"> </m:t>
+        </m:r>
+        <m:sSubSup>
+          <m:e>
+            <m:r>
+              <m:rPr>
+                <m:sty m:val="i"/>
+              </m:rPr>
+              <m:t xml:space="preserve">a</m:t>
+            </m:r>
+          </m:e>
+          <m:sub>
+            <m:r>
+              <m:rPr>
+                <m:sty m:val="i"/>
+              </m:rPr>
+              <m:t xml:space="preserve">t</m:t>
+            </m:r>
+            <m:r>
+              <m:rPr>
+                <m:sty m:val="p"/>
+              </m:rPr>
+              <m:t xml:space="preserve">,2</m:t>
+            </m:r>
+          </m:sub>
+          <m:sup>
+            <m:r>
+              <m:rPr>
+                <m:sty m:val="p"/>
+              </m:rPr>
+              <m:t xml:space="preserve">*</m:t>
+            </m:r>
+          </m:sup>
+        </m:sSubSup>
+      </m:oMath>
       <w:r>
         <w:rPr>
           <w:rFonts w:ascii="Times New Roman" w:hAnsi="Times New Roman" w:eastAsia="宋体"/>
@@ -1832,15 +2152,90 @@
         </w:rPr>
         <w:t xml:space="preserve">, where </w:t>
       </w:r>
-      <w:r>
-        <w:rPr>
-          <w:rFonts w:ascii="Times New Roman" w:hAnsi="Times New Roman" w:eastAsia="宋体"/>
-          <w:b w:val="0"/>
-          <w:i/>
-          <w:sz w:val="24"/>
-        </w:rPr>
-        <w:t>a^*_{t,1} \neq a^*_{t,2}</w:t>
-      </w:r>
+      <m:oMath>
+        <m:sSubSup>
+          <m:e>
+            <m:r>
+              <m:rPr>
+                <m:sty m:val="i"/>
+              </m:rPr>
+              <m:t xml:space="preserve">a</m:t>
+            </m:r>
+          </m:e>
+          <m:sub>
+            <m:r>
+              <m:rPr>
+                <m:sty m:val="i"/>
+              </m:rPr>
+              <m:t xml:space="preserve">t</m:t>
+            </m:r>
+            <m:r>
+              <m:rPr>
+                <m:sty m:val="p"/>
+              </m:rPr>
+              <m:t xml:space="preserve">,1</m:t>
+            </m:r>
+          </m:sub>
+          <m:sup>
+            <m:r>
+              <m:rPr>
+                <m:sty m:val="p"/>
+              </m:rPr>
+              <m:t xml:space="preserve">*</m:t>
+            </m:r>
+          </m:sup>
+        </m:sSubSup>
+        <m:r>
+          <m:rPr>
+            <m:sty m:val="p"/>
+          </m:rPr>
+          <m:t xml:space="preserve"> </m:t>
+        </m:r>
+        <m:r>
+          <m:rPr>
+            <m:sty m:val="p"/>
+          </m:rPr>
+          <m:t xml:space="preserve">≠</m:t>
+        </m:r>
+        <m:r>
+          <m:rPr>
+            <m:sty m:val="p"/>
+          </m:rPr>
+          <m:t xml:space="preserve"> </m:t>
+        </m:r>
+        <m:sSubSup>
+          <m:e>
+            <m:r>
+              <m:rPr>
+                <m:sty m:val="i"/>
+              </m:rPr>
+              <m:t xml:space="preserve">a</m:t>
+            </m:r>
+          </m:e>
+          <m:sub>
+            <m:r>
+              <m:rPr>
+                <m:sty m:val="i"/>
+              </m:rPr>
+              <m:t xml:space="preserve">t</m:t>
+            </m:r>
+            <m:r>
+              <m:rPr>
+                <m:sty m:val="p"/>
+              </m:rPr>
+              <m:t xml:space="preserve">,2</m:t>
+            </m:r>
+          </m:sub>
+          <m:sup>
+            <m:r>
+              <m:rPr>
+                <m:sty m:val="p"/>
+              </m:rPr>
+              <m:t xml:space="preserve">*</m:t>
+            </m:r>
+          </m:sup>
+        </m:sSubSup>
+      </m:oMath>
       <w:r>
         <w:rPr>
           <w:rFonts w:ascii="Times New Roman" w:hAnsi="Times New Roman" w:eastAsia="宋体"/>
@@ -1940,15 +2335,70 @@
         </w:rPr>
         <w:t xml:space="preserve"> 多个可抓物体时该抓哪一个？同一初始场景下专家抓不同物体，会形成冲突数据对 </w:t>
       </w:r>
-      <w:r>
-        <w:rPr>
-          <w:rFonts w:ascii="Times New Roman" w:hAnsi="Times New Roman" w:eastAsia="宋体"/>
-          <w:b w:val="0"/>
-          <w:i/>
-          <w:sz w:val="24"/>
-        </w:rPr>
-        <w:t>(s_t,a^*_{t,1})</w:t>
-      </w:r>
+      <m:oMath>
+        <m:r>
+          <m:rPr>
+            <m:sty m:val="p"/>
+          </m:rPr>
+          <m:t xml:space="preserve">(</m:t>
+        </m:r>
+        <m:sSub>
+          <m:e>
+            <m:r>
+              <m:rPr>
+                <m:sty m:val="i"/>
+              </m:rPr>
+              <m:t xml:space="preserve">s</m:t>
+            </m:r>
+          </m:e>
+          <m:sub>
+            <m:r>
+              <m:rPr>
+                <m:sty m:val="i"/>
+              </m:rPr>
+              <m:t xml:space="preserve">t</m:t>
+            </m:r>
+          </m:sub>
+        </m:sSub>
+        <m:r>
+          <m:rPr>
+            <m:sty m:val="p"/>
+          </m:rPr>
+          <m:t xml:space="preserve">,</m:t>
+        </m:r>
+        <m:sSubSup>
+          <m:e>
+            <m:r>
+              <m:rPr>
+                <m:sty m:val="i"/>
+              </m:rPr>
+              <m:t xml:space="preserve">a</m:t>
+            </m:r>
+          </m:e>
+          <m:sub>
+            <m:r>
+              <m:rPr>
+                <m:sty m:val="i"/>
+              </m:rPr>
+              <m:t xml:space="preserve">t</m:t>
+            </m:r>
+            <m:r>
+              <m:rPr>
+                <m:sty m:val="p"/>
+              </m:rPr>
+              <m:t xml:space="preserve">,1</m:t>
+            </m:r>
+          </m:sub>
+          <m:sup>
+            <m:r>
+              <m:rPr>
+                <m:sty m:val="p"/>
+              </m:rPr>
+              <m:t xml:space="preserve">*</m:t>
+            </m:r>
+          </m:sup>
+        </m:sSubSup>
+      </m:oMath>
       <w:r>
         <w:rPr>
           <w:rFonts w:ascii="Times New Roman" w:hAnsi="Times New Roman" w:eastAsia="宋体"/>
@@ -1958,15 +2408,70 @@
         </w:rPr>
         <w:t xml:space="preserve"> 与 </w:t>
       </w:r>
-      <w:r>
-        <w:rPr>
-          <w:rFonts w:ascii="Times New Roman" w:hAnsi="Times New Roman" w:eastAsia="宋体"/>
-          <w:b w:val="0"/>
-          <w:i/>
-          <w:sz w:val="24"/>
-        </w:rPr>
-        <w:t>(s_t,a^*_{t,2})</w:t>
-      </w:r>
+      <m:oMath>
+        <m:r>
+          <m:rPr>
+            <m:sty m:val="p"/>
+          </m:rPr>
+          <m:t xml:space="preserve">(</m:t>
+        </m:r>
+        <m:sSub>
+          <m:e>
+            <m:r>
+              <m:rPr>
+                <m:sty m:val="i"/>
+              </m:rPr>
+              <m:t xml:space="preserve">s</m:t>
+            </m:r>
+          </m:e>
+          <m:sub>
+            <m:r>
+              <m:rPr>
+                <m:sty m:val="i"/>
+              </m:rPr>
+              <m:t xml:space="preserve">t</m:t>
+            </m:r>
+          </m:sub>
+        </m:sSub>
+        <m:r>
+          <m:rPr>
+            <m:sty m:val="p"/>
+          </m:rPr>
+          <m:t xml:space="preserve">,</m:t>
+        </m:r>
+        <m:sSubSup>
+          <m:e>
+            <m:r>
+              <m:rPr>
+                <m:sty m:val="i"/>
+              </m:rPr>
+              <m:t xml:space="preserve">a</m:t>
+            </m:r>
+          </m:e>
+          <m:sub>
+            <m:r>
+              <m:rPr>
+                <m:sty m:val="i"/>
+              </m:rPr>
+              <m:t xml:space="preserve">t</m:t>
+            </m:r>
+            <m:r>
+              <m:rPr>
+                <m:sty m:val="p"/>
+              </m:rPr>
+              <m:t xml:space="preserve">,2</m:t>
+            </m:r>
+          </m:sub>
+          <m:sup>
+            <m:r>
+              <m:rPr>
+                <m:sty m:val="p"/>
+              </m:rPr>
+              <m:t xml:space="preserve">*</m:t>
+            </m:r>
+          </m:sup>
+        </m:sSubSup>
+      </m:oMath>
       <w:r>
         <w:rPr>
           <w:rFonts w:ascii="Times New Roman" w:hAnsi="Times New Roman" w:eastAsia="宋体"/>
@@ -1976,15 +2481,84 @@
         </w:rPr>
         <w:t xml:space="preserve">，且 </w:t>
       </w:r>
-      <w:r>
-        <w:rPr>
-          <w:rFonts w:ascii="Times New Roman" w:hAnsi="Times New Roman" w:eastAsia="宋体"/>
-          <w:b w:val="0"/>
-          <w:i/>
-          <w:sz w:val="24"/>
-        </w:rPr>
-        <w:t>a^*_{t,1}\neq a^*_{t,2}</w:t>
-      </w:r>
+      <m:oMath>
+        <m:sSubSup>
+          <m:e>
+            <m:r>
+              <m:rPr>
+                <m:sty m:val="i"/>
+              </m:rPr>
+              <m:t xml:space="preserve">a</m:t>
+            </m:r>
+          </m:e>
+          <m:sub>
+            <m:r>
+              <m:rPr>
+                <m:sty m:val="i"/>
+              </m:rPr>
+              <m:t xml:space="preserve">t</m:t>
+            </m:r>
+            <m:r>
+              <m:rPr>
+                <m:sty m:val="p"/>
+              </m:rPr>
+              <m:t xml:space="preserve">,1</m:t>
+            </m:r>
+          </m:sub>
+          <m:sup>
+            <m:r>
+              <m:rPr>
+                <m:sty m:val="p"/>
+              </m:rPr>
+              <m:t xml:space="preserve">*</m:t>
+            </m:r>
+          </m:sup>
+        </m:sSubSup>
+        <m:r>
+          <m:rPr>
+            <m:sty m:val="p"/>
+          </m:rPr>
+          <m:t xml:space="preserve">≠</m:t>
+        </m:r>
+        <m:r>
+          <m:rPr>
+            <m:sty m:val="p"/>
+          </m:rPr>
+          <m:t xml:space="preserve"> </m:t>
+        </m:r>
+        <m:sSubSup>
+          <m:e>
+            <m:r>
+              <m:rPr>
+                <m:sty m:val="i"/>
+              </m:rPr>
+              <m:t xml:space="preserve">a</m:t>
+            </m:r>
+          </m:e>
+          <m:sub>
+            <m:r>
+              <m:rPr>
+                <m:sty m:val="i"/>
+              </m:rPr>
+              <m:t xml:space="preserve">t</m:t>
+            </m:r>
+            <m:r>
+              <m:rPr>
+                <m:sty m:val="p"/>
+              </m:rPr>
+              <m:t xml:space="preserve">,2</m:t>
+            </m:r>
+          </m:sub>
+          <m:sup>
+            <m:r>
+              <m:rPr>
+                <m:sty m:val="p"/>
+              </m:rPr>
+              <m:t xml:space="preserve">*</m:t>
+            </m:r>
+          </m:sup>
+        </m:sSubSup>
+      </m:oMath>
       <w:r>
         <w:rPr>
           <w:rFonts w:ascii="Times New Roman" w:hAnsi="Times New Roman" w:eastAsia="宋体"/>
@@ -2117,15 +2691,14 @@
         </w:rPr>
         <w:t xml:space="preserve"> We reformulate the problem by introducing an object-specifying prompt, </w:t>
       </w:r>
-      <w:r>
-        <w:rPr>
-          <w:rFonts w:ascii="Times New Roman" w:hAnsi="Times New Roman" w:eastAsia="宋体"/>
-          <w:b w:val="0"/>
-          <w:i/>
-          <w:sz w:val="24"/>
-        </w:rPr>
-        <w:t>p</w:t>
-      </w:r>
+      <m:oMath>
+        <m:r>
+          <m:rPr>
+            <m:sty m:val="i"/>
+          </m:rPr>
+          <m:t xml:space="preserve">p</m:t>
+        </m:r>
+      </m:oMath>
       <w:r>
         <w:rPr>
           <w:rFonts w:ascii="Times New Roman" w:hAnsi="Times New Roman" w:eastAsia="宋体"/>
@@ -2135,15 +2708,92 @@
         </w:rPr>
         <w:t xml:space="preserve">, as an additional condition for the policy. The policy’s task becomes learning the mapping </w:t>
       </w:r>
-      <w:r>
-        <w:rPr>
-          <w:rFonts w:ascii="Times New Roman" w:hAnsi="Times New Roman" w:eastAsia="宋体"/>
-          <w:b w:val="0"/>
-          <w:i/>
-          <w:sz w:val="24"/>
-        </w:rPr>
-        <w:t>\pi(a_t \mid s_t, p)</w:t>
-      </w:r>
+      <m:oMath>
+        <m:r>
+          <m:rPr>
+            <m:sty m:val="p"/>
+          </m:rPr>
+          <m:t xml:space="preserve">π</m:t>
+        </m:r>
+        <m:r>
+          <m:rPr>
+            <m:sty m:val="p"/>
+          </m:rPr>
+          <m:t xml:space="preserve">(</m:t>
+        </m:r>
+        <m:sSub>
+          <m:e>
+            <m:r>
+              <m:rPr>
+                <m:sty m:val="i"/>
+              </m:rPr>
+              <m:t xml:space="preserve">a</m:t>
+            </m:r>
+          </m:e>
+          <m:sub>
+            <m:r>
+              <m:rPr>
+                <m:sty m:val="i"/>
+              </m:rPr>
+              <m:t xml:space="preserve">t</m:t>
+            </m:r>
+          </m:sub>
+        </m:sSub>
+        <m:r>
+          <m:rPr>
+            <m:sty m:val="p"/>
+          </m:rPr>
+          <m:t xml:space="preserve"> </m:t>
+        </m:r>
+        <m:r>
+          <m:rPr>
+            <m:sty m:val="p"/>
+          </m:rPr>
+          <m:t xml:space="preserve">\mid</m:t>
+        </m:r>
+        <m:r>
+          <m:rPr>
+            <m:sty m:val="p"/>
+          </m:rPr>
+          <m:t xml:space="preserve"> </m:t>
+        </m:r>
+        <m:sSub>
+          <m:e>
+            <m:r>
+              <m:rPr>
+                <m:sty m:val="i"/>
+              </m:rPr>
+              <m:t xml:space="preserve">s</m:t>
+            </m:r>
+          </m:e>
+          <m:sub>
+            <m:r>
+              <m:rPr>
+                <m:sty m:val="i"/>
+              </m:rPr>
+              <m:t xml:space="preserve">t</m:t>
+            </m:r>
+          </m:sub>
+        </m:sSub>
+        <m:r>
+          <m:rPr>
+            <m:sty m:val="p"/>
+          </m:rPr>
+          <m:t xml:space="preserve">,</m:t>
+        </m:r>
+        <m:r>
+          <m:rPr>
+            <m:sty m:val="p"/>
+          </m:rPr>
+          <m:t xml:space="preserve"> </m:t>
+        </m:r>
+        <m:r>
+          <m:rPr>
+            <m:sty m:val="i"/>
+          </m:rPr>
+          <m:t xml:space="preserve">p</m:t>
+        </m:r>
+      </m:oMath>
       <w:r>
         <w:rPr>
           <w:rFonts w:ascii="Times New Roman" w:hAnsi="Times New Roman" w:eastAsia="宋体"/>
@@ -2153,15 +2803,14 @@
         </w:rPr>
         <w:t xml:space="preserve">. The prompt </w:t>
       </w:r>
-      <w:r>
-        <w:rPr>
-          <w:rFonts w:ascii="Times New Roman" w:hAnsi="Times New Roman" w:eastAsia="宋体"/>
-          <w:b w:val="0"/>
-          <w:i/>
-          <w:sz w:val="24"/>
-        </w:rPr>
-        <w:t>p</w:t>
-      </w:r>
+      <m:oMath>
+        <m:r>
+          <m:rPr>
+            <m:sty m:val="i"/>
+          </m:rPr>
+          <m:t xml:space="preserve">p</m:t>
+        </m:r>
+      </m:oMath>
       <w:r>
         <w:rPr>
           <w:rFonts w:ascii="Times New Roman" w:hAnsi="Times New Roman" w:eastAsia="宋体"/>
@@ -2171,15 +2820,26 @@
         </w:rPr>
         <w:t xml:space="preserve"> (e.g., a bounding box provided by an object detection model) uniquely identifies a target object </w:t>
       </w:r>
-      <w:r>
-        <w:rPr>
-          <w:rFonts w:ascii="Times New Roman" w:hAnsi="Times New Roman" w:eastAsia="宋体"/>
-          <w:b w:val="0"/>
-          <w:i/>
-          <w:sz w:val="24"/>
-        </w:rPr>
-        <w:t>o_i</w:t>
-      </w:r>
+      <m:oMath>
+        <m:sSub>
+          <m:e>
+            <m:r>
+              <m:rPr>
+                <m:sty m:val="i"/>
+              </m:rPr>
+              <m:t xml:space="preserve">o</m:t>
+            </m:r>
+          </m:e>
+          <m:sub>
+            <m:r>
+              <m:rPr>
+                <m:sty m:val="i"/>
+              </m:rPr>
+              <m:t xml:space="preserve">i</m:t>
+            </m:r>
+          </m:sub>
+        </m:sSub>
+      </m:oMath>
       <w:r>
         <w:rPr>
           <w:rFonts w:ascii="Times New Roman" w:hAnsi="Times New Roman" w:eastAsia="宋体"/>
@@ -2189,15 +2849,50 @@
         </w:rPr>
         <w:t xml:space="preserve"> within the scene. For any given pair of </w:t>
       </w:r>
-      <w:r>
-        <w:rPr>
-          <w:rFonts w:ascii="Times New Roman" w:hAnsi="Times New Roman" w:eastAsia="宋体"/>
-          <w:b w:val="0"/>
-          <w:i/>
-          <w:sz w:val="24"/>
-        </w:rPr>
-        <w:t>(s_t, p)</w:t>
-      </w:r>
+      <m:oMath>
+        <m:r>
+          <m:rPr>
+            <m:sty m:val="p"/>
+          </m:rPr>
+          <m:t xml:space="preserve">(</m:t>
+        </m:r>
+        <m:sSub>
+          <m:e>
+            <m:r>
+              <m:rPr>
+                <m:sty m:val="i"/>
+              </m:rPr>
+              <m:t xml:space="preserve">s</m:t>
+            </m:r>
+          </m:e>
+          <m:sub>
+            <m:r>
+              <m:rPr>
+                <m:sty m:val="i"/>
+              </m:rPr>
+              <m:t xml:space="preserve">t</m:t>
+            </m:r>
+          </m:sub>
+        </m:sSub>
+        <m:r>
+          <m:rPr>
+            <m:sty m:val="p"/>
+          </m:rPr>
+          <m:t xml:space="preserve">,</m:t>
+        </m:r>
+        <m:r>
+          <m:rPr>
+            <m:sty m:val="p"/>
+          </m:rPr>
+          <m:t xml:space="preserve"> </m:t>
+        </m:r>
+        <m:r>
+          <m:rPr>
+            <m:sty m:val="i"/>
+          </m:rPr>
+          <m:t xml:space="preserve">p</m:t>
+        </m:r>
+      </m:oMath>
       <w:r>
         <w:rPr>
           <w:rFonts w:ascii="Times New Roman" w:hAnsi="Times New Roman" w:eastAsia="宋体"/>
@@ -2207,15 +2902,34 @@
         </w:rPr>
         <w:t xml:space="preserve">, the corresponding expert action </w:t>
       </w:r>
-      <w:r>
-        <w:rPr>
-          <w:rFonts w:ascii="Times New Roman" w:hAnsi="Times New Roman" w:eastAsia="宋体"/>
-          <w:b w:val="0"/>
-          <w:i/>
-          <w:sz w:val="24"/>
-        </w:rPr>
-        <w:t>a^*_t</w:t>
-      </w:r>
+      <m:oMath>
+        <m:sSubSup>
+          <m:e>
+            <m:r>
+              <m:rPr>
+                <m:sty m:val="i"/>
+              </m:rPr>
+              <m:t xml:space="preserve">a</m:t>
+            </m:r>
+          </m:e>
+          <m:sub>
+            <m:r>
+              <m:rPr>
+                <m:sty m:val="i"/>
+              </m:rPr>
+              <m:t xml:space="preserve">t</m:t>
+            </m:r>
+          </m:sub>
+          <m:sup>
+            <m:r>
+              <m:rPr>
+                <m:sty m:val="p"/>
+              </m:rPr>
+              <m:t xml:space="preserve">*</m:t>
+            </m:r>
+          </m:sup>
+        </m:sSubSup>
+      </m:oMath>
       <w:r>
         <w:rPr>
           <w:rFonts w:ascii="Times New Roman" w:hAnsi="Times New Roman" w:eastAsia="宋体"/>
@@ -2249,15 +2963,14 @@
         </w:rPr>
         <w:t xml:space="preserve"> 我们引入指定物体的提示 </w:t>
       </w:r>
-      <w:r>
-        <w:rPr>
-          <w:rFonts w:ascii="Times New Roman" w:hAnsi="Times New Roman" w:eastAsia="宋体"/>
-          <w:b w:val="0"/>
-          <w:i/>
-          <w:sz w:val="24"/>
-        </w:rPr>
-        <w:t>p</w:t>
-      </w:r>
+      <m:oMath>
+        <m:r>
+          <m:rPr>
+            <m:sty m:val="i"/>
+          </m:rPr>
+          <m:t xml:space="preserve">p</m:t>
+        </m:r>
+      </m:oMath>
       <w:r>
         <w:rPr>
           <w:rFonts w:ascii="Times New Roman" w:hAnsi="Times New Roman" w:eastAsia="宋体"/>
@@ -2267,15 +2980,80 @@
         </w:rPr>
         <w:t xml:space="preserve"> 作为策略额外条件，任务变为学习 </w:t>
       </w:r>
-      <w:r>
-        <w:rPr>
-          <w:rFonts w:ascii="Times New Roman" w:hAnsi="Times New Roman" w:eastAsia="宋体"/>
-          <w:b w:val="0"/>
-          <w:i/>
-          <w:sz w:val="24"/>
-        </w:rPr>
-        <w:t>\pi(a_t\mid s_t,p)</w:t>
-      </w:r>
+      <m:oMath>
+        <m:r>
+          <m:rPr>
+            <m:sty m:val="p"/>
+          </m:rPr>
+          <m:t xml:space="preserve">π</m:t>
+        </m:r>
+        <m:r>
+          <m:rPr>
+            <m:sty m:val="p"/>
+          </m:rPr>
+          <m:t xml:space="preserve">(</m:t>
+        </m:r>
+        <m:sSub>
+          <m:e>
+            <m:r>
+              <m:rPr>
+                <m:sty m:val="i"/>
+              </m:rPr>
+              <m:t xml:space="preserve">a</m:t>
+            </m:r>
+          </m:e>
+          <m:sub>
+            <m:r>
+              <m:rPr>
+                <m:sty m:val="i"/>
+              </m:rPr>
+              <m:t xml:space="preserve">t</m:t>
+            </m:r>
+          </m:sub>
+        </m:sSub>
+        <m:r>
+          <m:rPr>
+            <m:sty m:val="p"/>
+          </m:rPr>
+          <m:t xml:space="preserve">\mid</m:t>
+        </m:r>
+        <m:r>
+          <m:rPr>
+            <m:sty m:val="p"/>
+          </m:rPr>
+          <m:t xml:space="preserve"> </m:t>
+        </m:r>
+        <m:sSub>
+          <m:e>
+            <m:r>
+              <m:rPr>
+                <m:sty m:val="i"/>
+              </m:rPr>
+              <m:t xml:space="preserve">s</m:t>
+            </m:r>
+          </m:e>
+          <m:sub>
+            <m:r>
+              <m:rPr>
+                <m:sty m:val="i"/>
+              </m:rPr>
+              <m:t xml:space="preserve">t</m:t>
+            </m:r>
+          </m:sub>
+        </m:sSub>
+        <m:r>
+          <m:rPr>
+            <m:sty m:val="p"/>
+          </m:rPr>
+          <m:t xml:space="preserve">,</m:t>
+        </m:r>
+        <m:r>
+          <m:rPr>
+            <m:sty m:val="i"/>
+          </m:rPr>
+          <m:t xml:space="preserve">p</m:t>
+        </m:r>
+      </m:oMath>
       <w:r>
         <w:rPr>
           <w:rFonts w:ascii="Times New Roman" w:hAnsi="Times New Roman" w:eastAsia="宋体"/>
@@ -2285,15 +3063,14 @@
         </w:rPr>
         <w:t xml:space="preserve">。提示 </w:t>
       </w:r>
-      <w:r>
-        <w:rPr>
-          <w:rFonts w:ascii="Times New Roman" w:hAnsi="Times New Roman" w:eastAsia="宋体"/>
-          <w:b w:val="0"/>
-          <w:i/>
-          <w:sz w:val="24"/>
-        </w:rPr>
-        <w:t>p</w:t>
-      </w:r>
+      <m:oMath>
+        <m:r>
+          <m:rPr>
+            <m:sty m:val="i"/>
+          </m:rPr>
+          <m:t xml:space="preserve">p</m:t>
+        </m:r>
+      </m:oMath>
       <w:r>
         <w:rPr>
           <w:rFonts w:ascii="Times New Roman" w:hAnsi="Times New Roman" w:eastAsia="宋体"/>
@@ -2303,15 +3080,26 @@
         </w:rPr>
         <w:t xml:space="preserve">（如检测器给出的边界框）唯一标识场景中的目标 </w:t>
       </w:r>
-      <w:r>
-        <w:rPr>
-          <w:rFonts w:ascii="Times New Roman" w:hAnsi="Times New Roman" w:eastAsia="宋体"/>
-          <w:b w:val="0"/>
-          <w:i/>
-          <w:sz w:val="24"/>
-        </w:rPr>
-        <w:t>o_i</w:t>
-      </w:r>
+      <m:oMath>
+        <m:sSub>
+          <m:e>
+            <m:r>
+              <m:rPr>
+                <m:sty m:val="i"/>
+              </m:rPr>
+              <m:t xml:space="preserve">o</m:t>
+            </m:r>
+          </m:e>
+          <m:sub>
+            <m:r>
+              <m:rPr>
+                <m:sty m:val="i"/>
+              </m:rPr>
+              <m:t xml:space="preserve">i</m:t>
+            </m:r>
+          </m:sub>
+        </m:sSub>
+      </m:oMath>
       <w:r>
         <w:rPr>
           <w:rFonts w:ascii="Times New Roman" w:hAnsi="Times New Roman" w:eastAsia="宋体"/>
@@ -2321,15 +3109,44 @@
         </w:rPr>
         <w:t xml:space="preserve">。对任意 </w:t>
       </w:r>
-      <w:r>
-        <w:rPr>
-          <w:rFonts w:ascii="Times New Roman" w:hAnsi="Times New Roman" w:eastAsia="宋体"/>
-          <w:b w:val="0"/>
-          <w:i/>
-          <w:sz w:val="24"/>
-        </w:rPr>
-        <w:t>(s_t,p)</w:t>
-      </w:r>
+      <m:oMath>
+        <m:r>
+          <m:rPr>
+            <m:sty m:val="p"/>
+          </m:rPr>
+          <m:t xml:space="preserve">(</m:t>
+        </m:r>
+        <m:sSub>
+          <m:e>
+            <m:r>
+              <m:rPr>
+                <m:sty m:val="i"/>
+              </m:rPr>
+              <m:t xml:space="preserve">s</m:t>
+            </m:r>
+          </m:e>
+          <m:sub>
+            <m:r>
+              <m:rPr>
+                <m:sty m:val="i"/>
+              </m:rPr>
+              <m:t xml:space="preserve">t</m:t>
+            </m:r>
+          </m:sub>
+        </m:sSub>
+        <m:r>
+          <m:rPr>
+            <m:sty m:val="p"/>
+          </m:rPr>
+          <m:t xml:space="preserve">,</m:t>
+        </m:r>
+        <m:r>
+          <m:rPr>
+            <m:sty m:val="i"/>
+          </m:rPr>
+          <m:t xml:space="preserve">p</m:t>
+        </m:r>
+      </m:oMath>
       <w:r>
         <w:rPr>
           <w:rFonts w:ascii="Times New Roman" w:hAnsi="Times New Roman" w:eastAsia="宋体"/>
@@ -2339,15 +3156,34 @@
         </w:rPr>
         <w:t xml:space="preserve">，对应专家动作 </w:t>
       </w:r>
-      <w:r>
-        <w:rPr>
-          <w:rFonts w:ascii="Times New Roman" w:hAnsi="Times New Roman" w:eastAsia="宋体"/>
-          <w:b w:val="0"/>
-          <w:i/>
-          <w:sz w:val="24"/>
-        </w:rPr>
-        <w:t>a^*_t</w:t>
-      </w:r>
+      <m:oMath>
+        <m:sSubSup>
+          <m:e>
+            <m:r>
+              <m:rPr>
+                <m:sty m:val="i"/>
+              </m:rPr>
+              <m:t xml:space="preserve">a</m:t>
+            </m:r>
+          </m:e>
+          <m:sub>
+            <m:r>
+              <m:rPr>
+                <m:sty m:val="i"/>
+              </m:rPr>
+              <m:t xml:space="preserve">t</m:t>
+            </m:r>
+          </m:sub>
+          <m:sup>
+            <m:r>
+              <m:rPr>
+                <m:sty m:val="p"/>
+              </m:rPr>
+              <m:t xml:space="preserve">*</m:t>
+            </m:r>
+          </m:sup>
+        </m:sSubSup>
+      </m:oMath>
       <w:r>
         <w:rPr>
           <w:rFonts w:ascii="Times New Roman" w:hAnsi="Times New Roman" w:eastAsia="宋体"/>
@@ -2461,15 +3297,14 @@
         </w:rPr>
         <w:t xml:space="preserve"> We utilize the complete, pre-trained Segment Anything Model 2 (SAM2) with all its parameters frozen. SAM2’s role is to act as a powerful temporal-visual feature extractor. Given an initial prompt </w:t>
       </w:r>
-      <w:r>
-        <w:rPr>
-          <w:rFonts w:ascii="Times New Roman" w:hAnsi="Times New Roman" w:eastAsia="宋体"/>
-          <w:b w:val="0"/>
-          <w:i/>
-          <w:sz w:val="24"/>
-        </w:rPr>
-        <w:t>p</w:t>
-      </w:r>
+      <m:oMath>
+        <m:r>
+          <m:rPr>
+            <m:sty m:val="i"/>
+          </m:rPr>
+          <m:t xml:space="preserve">p</m:t>
+        </m:r>
+      </m:oMath>
       <w:r>
         <w:rPr>
           <w:rFonts w:ascii="Times New Roman" w:hAnsi="Times New Roman" w:eastAsia="宋体"/>
@@ -2479,15 +3314,74 @@
         </w:rPr>
         <w:t xml:space="preserve"> and a video stream </w:t>
       </w:r>
-      <w:r>
-        <w:rPr>
-          <w:rFonts w:ascii="Times New Roman" w:hAnsi="Times New Roman" w:eastAsia="宋体"/>
-          <w:b w:val="0"/>
-          <w:i/>
-          <w:sz w:val="24"/>
-        </w:rPr>
-        <w:t>(I_0, \ldots, I_T)</w:t>
-      </w:r>
+      <m:oMath>
+        <m:r>
+          <m:rPr>
+            <m:sty m:val="p"/>
+          </m:rPr>
+          <m:t xml:space="preserve">(</m:t>
+        </m:r>
+        <m:sSub>
+          <m:e>
+            <m:r>
+              <m:rPr>
+                <m:sty m:val="i"/>
+              </m:rPr>
+              <m:t xml:space="preserve">I</m:t>
+            </m:r>
+          </m:e>
+          <m:sub>
+            <m:r>
+              <m:rPr>
+                <m:sty m:val="p"/>
+              </m:rPr>
+              <m:t xml:space="preserve">0,</m:t>
+            </m:r>
+          </m:sub>
+        </m:sSub>
+        <m:r>
+          <m:rPr>
+            <m:sty m:val="p"/>
+          </m:rPr>
+          <m:t xml:space="preserve"> </m:t>
+        </m:r>
+        <m:r>
+          <m:rPr>
+            <m:sty m:val="p"/>
+          </m:rPr>
+          <m:t xml:space="preserve">…</m:t>
+        </m:r>
+        <m:r>
+          <m:rPr>
+            <m:sty m:val="p"/>
+          </m:rPr>
+          <m:t xml:space="preserve">,</m:t>
+        </m:r>
+        <m:r>
+          <m:rPr>
+            <m:sty m:val="p"/>
+          </m:rPr>
+          <m:t xml:space="preserve"> </m:t>
+        </m:r>
+        <m:sSub>
+          <m:e>
+            <m:r>
+              <m:rPr>
+                <m:sty m:val="i"/>
+              </m:rPr>
+              <m:t xml:space="preserve">I</m:t>
+            </m:r>
+          </m:e>
+          <m:sub>
+            <m:r>
+              <m:rPr>
+                <m:sty m:val="i"/>
+              </m:rPr>
+              <m:t xml:space="preserve">T</m:t>
+            </m:r>
+          </m:sub>
+        </m:sSub>
+      </m:oMath>
       <w:r>
         <w:rPr>
           <w:rFonts w:ascii="Times New Roman" w:hAnsi="Times New Roman" w:eastAsia="宋体"/>
@@ -2497,15 +3391,26 @@
         </w:rPr>
         <w:t xml:space="preserve">, its internal memory and tracking mechanisms allow it to identify and follow a specific object, producing a sequence of rich, object-aware feature representations </w:t>
       </w:r>
-      <w:r>
-        <w:rPr>
-          <w:rFonts w:ascii="Times New Roman" w:hAnsi="Times New Roman" w:eastAsia="宋体"/>
-          <w:b w:val="0"/>
-          <w:i/>
-          <w:sz w:val="24"/>
-        </w:rPr>
-        <w:t>F_t</w:t>
-      </w:r>
+      <m:oMath>
+        <m:sSub>
+          <m:e>
+            <m:r>
+              <m:rPr>
+                <m:sty m:val="i"/>
+              </m:rPr>
+              <m:t xml:space="preserve">F</m:t>
+            </m:r>
+          </m:e>
+          <m:sub>
+            <m:r>
+              <m:rPr>
+                <m:sty m:val="i"/>
+              </m:rPr>
+              <m:t xml:space="preserve">t</m:t>
+            </m:r>
+          </m:sub>
+        </m:sSub>
+      </m:oMath>
       <w:r>
         <w:rPr>
           <w:rFonts w:ascii="Times New Roman" w:hAnsi="Times New Roman" w:eastAsia="宋体"/>
@@ -2557,15 +3462,14 @@
         </w:rPr>
         <w:t xml:space="preserve"> 使用完整预训练 SAM2，参数全部冻结。SAM2 充当强大的时序视觉特征提取器：给定初始提示 </w:t>
       </w:r>
-      <w:r>
-        <w:rPr>
-          <w:rFonts w:ascii="Times New Roman" w:hAnsi="Times New Roman" w:eastAsia="宋体"/>
-          <w:b w:val="0"/>
-          <w:i/>
-          <w:sz w:val="24"/>
-        </w:rPr>
-        <w:t>p</w:t>
-      </w:r>
+      <m:oMath>
+        <m:r>
+          <m:rPr>
+            <m:sty m:val="i"/>
+          </m:rPr>
+          <m:t xml:space="preserve">p</m:t>
+        </m:r>
+      </m:oMath>
       <w:r>
         <w:rPr>
           <w:rFonts w:ascii="Times New Roman" w:hAnsi="Times New Roman" w:eastAsia="宋体"/>
@@ -2575,15 +3479,62 @@
         </w:rPr>
         <w:t xml:space="preserve"> 与视频流 </w:t>
       </w:r>
-      <w:r>
-        <w:rPr>
-          <w:rFonts w:ascii="Times New Roman" w:hAnsi="Times New Roman" w:eastAsia="宋体"/>
-          <w:b w:val="0"/>
-          <w:i/>
-          <w:sz w:val="24"/>
-        </w:rPr>
-        <w:t>(I_0,\ldots,I_T)</w:t>
-      </w:r>
+      <m:oMath>
+        <m:r>
+          <m:rPr>
+            <m:sty m:val="p"/>
+          </m:rPr>
+          <m:t xml:space="preserve">(</m:t>
+        </m:r>
+        <m:sSub>
+          <m:e>
+            <m:r>
+              <m:rPr>
+                <m:sty m:val="i"/>
+              </m:rPr>
+              <m:t xml:space="preserve">I</m:t>
+            </m:r>
+          </m:e>
+          <m:sub>
+            <m:r>
+              <m:rPr>
+                <m:sty m:val="p"/>
+              </m:rPr>
+              <m:t xml:space="preserve">0,</m:t>
+            </m:r>
+          </m:sub>
+        </m:sSub>
+        <m:r>
+          <m:rPr>
+            <m:sty m:val="p"/>
+          </m:rPr>
+          <m:t xml:space="preserve">…</m:t>
+        </m:r>
+        <m:r>
+          <m:rPr>
+            <m:sty m:val="p"/>
+          </m:rPr>
+          <m:t xml:space="preserve">,</m:t>
+        </m:r>
+        <m:sSub>
+          <m:e>
+            <m:r>
+              <m:rPr>
+                <m:sty m:val="i"/>
+              </m:rPr>
+              <m:t xml:space="preserve">I</m:t>
+            </m:r>
+          </m:e>
+          <m:sub>
+            <m:r>
+              <m:rPr>
+                <m:sty m:val="i"/>
+              </m:rPr>
+              <m:t xml:space="preserve">T</m:t>
+            </m:r>
+          </m:sub>
+        </m:sSub>
+      </m:oMath>
       <w:r>
         <w:rPr>
           <w:rFonts w:ascii="Times New Roman" w:hAnsi="Times New Roman" w:eastAsia="宋体"/>
@@ -2593,15 +3544,26 @@
         </w:rPr>
         <w:t xml:space="preserve">，其内部记忆与追踪机制识别并跟随特定物体，在每一时刻产出丰富的物体感知特征 </w:t>
       </w:r>
-      <w:r>
-        <w:rPr>
-          <w:rFonts w:ascii="Times New Roman" w:hAnsi="Times New Roman" w:eastAsia="宋体"/>
-          <w:b w:val="0"/>
-          <w:i/>
-          <w:sz w:val="24"/>
-        </w:rPr>
-        <w:t>F_t</w:t>
-      </w:r>
+      <m:oMath>
+        <m:sSub>
+          <m:e>
+            <m:r>
+              <m:rPr>
+                <m:sty m:val="i"/>
+              </m:rPr>
+              <m:t xml:space="preserve">F</m:t>
+            </m:r>
+          </m:e>
+          <m:sub>
+            <m:r>
+              <m:rPr>
+                <m:sty m:val="i"/>
+              </m:rPr>
+              <m:t xml:space="preserve">t</m:t>
+            </m:r>
+          </m:sub>
+        </m:sSub>
+      </m:oMath>
       <w:r>
         <w:rPr>
           <w:rFonts w:ascii="Times New Roman" w:hAnsi="Times New Roman" w:eastAsia="宋体"/>
@@ -2719,15 +3681,14 @@
         </w:rPr>
         <w:t xml:space="preserve"> The ACT policy head in our framework takes two inputs at each timestep </w:t>
       </w:r>
-      <w:r>
-        <w:rPr>
-          <w:rFonts w:ascii="Times New Roman" w:hAnsi="Times New Roman" w:eastAsia="宋体"/>
-          <w:b w:val="0"/>
-          <w:i/>
-          <w:sz w:val="24"/>
-        </w:rPr>
-        <w:t>t</w:t>
-      </w:r>
+      <m:oMath>
+        <m:r>
+          <m:rPr>
+            <m:sty m:val="i"/>
+          </m:rPr>
+          <m:t xml:space="preserve">t</m:t>
+        </m:r>
+      </m:oMath>
       <w:r>
         <w:rPr>
           <w:rFonts w:ascii="Times New Roman" w:hAnsi="Times New Roman" w:eastAsia="宋体"/>
@@ -2737,15 +3698,26 @@
         </w:rPr>
         <w:t xml:space="preserve">: the object-aware feature vector </w:t>
       </w:r>
-      <w:r>
-        <w:rPr>
-          <w:rFonts w:ascii="Times New Roman" w:hAnsi="Times New Roman" w:eastAsia="宋体"/>
-          <w:b w:val="0"/>
-          <w:i/>
-          <w:sz w:val="24"/>
-        </w:rPr>
-        <w:t>F_t</w:t>
-      </w:r>
+      <m:oMath>
+        <m:sSub>
+          <m:e>
+            <m:r>
+              <m:rPr>
+                <m:sty m:val="i"/>
+              </m:rPr>
+              <m:t xml:space="preserve">F</m:t>
+            </m:r>
+          </m:e>
+          <m:sub>
+            <m:r>
+              <m:rPr>
+                <m:sty m:val="i"/>
+              </m:rPr>
+              <m:t xml:space="preserve">t</m:t>
+            </m:r>
+          </m:sub>
+        </m:sSub>
+      </m:oMath>
       <w:r>
         <w:rPr>
           <w:rFonts w:ascii="Times New Roman" w:hAnsi="Times New Roman" w:eastAsia="宋体"/>
@@ -2755,15 +3727,26 @@
         </w:rPr>
         <w:t xml:space="preserve"> extracted by SAM2, and the robot’s current proprioceptive state </w:t>
       </w:r>
-      <w:r>
-        <w:rPr>
-          <w:rFonts w:ascii="Times New Roman" w:hAnsi="Times New Roman" w:eastAsia="宋体"/>
-          <w:b w:val="0"/>
-          <w:i/>
-          <w:sz w:val="24"/>
-        </w:rPr>
-        <w:t>Prop_t</w:t>
-      </w:r>
+      <m:oMath>
+        <m:sSub>
+          <m:e>
+            <m:r>
+              <m:rPr>
+                <m:sty m:val="i"/>
+              </m:rPr>
+              <m:t xml:space="preserve">Prop</m:t>
+            </m:r>
+          </m:e>
+          <m:sub>
+            <m:r>
+              <m:rPr>
+                <m:sty m:val="i"/>
+              </m:rPr>
+              <m:t xml:space="preserve">t</m:t>
+            </m:r>
+          </m:sub>
+        </m:sSub>
+      </m:oMath>
       <w:r>
         <w:rPr>
           <w:rFonts w:ascii="Times New Roman" w:hAnsi="Times New Roman" w:eastAsia="宋体"/>
@@ -2863,15 +3846,14 @@
         </w:rPr>
         <w:t xml:space="preserve"> 每一时刻 </w:t>
       </w:r>
-      <w:r>
-        <w:rPr>
-          <w:rFonts w:ascii="Times New Roman" w:hAnsi="Times New Roman" w:eastAsia="宋体"/>
-          <w:b w:val="0"/>
-          <w:i/>
-          <w:sz w:val="24"/>
-        </w:rPr>
-        <w:t>t</w:t>
-      </w:r>
+      <m:oMath>
+        <m:r>
+          <m:rPr>
+            <m:sty m:val="i"/>
+          </m:rPr>
+          <m:t xml:space="preserve">t</m:t>
+        </m:r>
+      </m:oMath>
       <w:r>
         <w:rPr>
           <w:rFonts w:ascii="Times New Roman" w:hAnsi="Times New Roman" w:eastAsia="宋体"/>
@@ -2881,15 +3863,26 @@
         </w:rPr>
         <w:t xml:space="preserve">，ACT 头接收两路输入：SAM2 提取的物体感知特征 </w:t>
       </w:r>
-      <w:r>
-        <w:rPr>
-          <w:rFonts w:ascii="Times New Roman" w:hAnsi="Times New Roman" w:eastAsia="宋体"/>
-          <w:b w:val="0"/>
-          <w:i/>
-          <w:sz w:val="24"/>
-        </w:rPr>
-        <w:t>F_t</w:t>
-      </w:r>
+      <m:oMath>
+        <m:sSub>
+          <m:e>
+            <m:r>
+              <m:rPr>
+                <m:sty m:val="i"/>
+              </m:rPr>
+              <m:t xml:space="preserve">F</m:t>
+            </m:r>
+          </m:e>
+          <m:sub>
+            <m:r>
+              <m:rPr>
+                <m:sty m:val="i"/>
+              </m:rPr>
+              <m:t xml:space="preserve">t</m:t>
+            </m:r>
+          </m:sub>
+        </m:sSub>
+      </m:oMath>
       <w:r>
         <w:rPr>
           <w:rFonts w:ascii="Times New Roman" w:hAnsi="Times New Roman" w:eastAsia="宋体"/>
@@ -2899,15 +3892,26 @@
         </w:rPr>
         <w:t xml:space="preserve">，以及当前本体感知 </w:t>
       </w:r>
-      <w:r>
-        <w:rPr>
-          <w:rFonts w:ascii="Times New Roman" w:hAnsi="Times New Roman" w:eastAsia="宋体"/>
-          <w:b w:val="0"/>
-          <w:i/>
-          <w:sz w:val="24"/>
-        </w:rPr>
-        <w:t>Prop_t</w:t>
-      </w:r>
+      <m:oMath>
+        <m:sSub>
+          <m:e>
+            <m:r>
+              <m:rPr>
+                <m:sty m:val="i"/>
+              </m:rPr>
+              <m:t xml:space="preserve">Prop</m:t>
+            </m:r>
+          </m:e>
+          <m:sub>
+            <m:r>
+              <m:rPr>
+                <m:sty m:val="i"/>
+              </m:rPr>
+              <m:t xml:space="preserve">t</m:t>
+            </m:r>
+          </m:sub>
+        </m:sSub>
+      </m:oMath>
       <w:r>
         <w:rPr>
           <w:rFonts w:ascii="Times New Roman" w:hAnsi="Times New Roman" w:eastAsia="宋体"/>
@@ -3138,15 +4142,26 @@
         </w:rPr>
         <w:t xml:space="preserve"> SAM2Grasp 架构。用提示引导冻结 SAM2 提取物体中心特征，再送入可训 ACT 策略头。</w:t>
       </w:r>
-      <w:r>
-        <w:rPr>
-          <w:rFonts w:ascii="Times New Roman" w:hAnsi="Times New Roman" w:eastAsia="宋体"/>
-          <w:b w:val="0"/>
-          <w:i/>
-          <w:sz w:val="24"/>
-        </w:rPr>
-        <w:t>t=0</w:t>
-      </w:r>
+      <m:oMath>
+        <m:r>
+          <m:rPr>
+            <m:sty m:val="i"/>
+          </m:rPr>
+          <m:t xml:space="preserve">t</m:t>
+        </m:r>
+        <m:r>
+          <m:rPr>
+            <m:sty m:val="p"/>
+          </m:rPr>
+          <m:t xml:space="preserve">=</m:t>
+        </m:r>
+        <m:r>
+          <m:rPr>
+            <m:sty m:val="p"/>
+          </m:rPr>
+          <m:t xml:space="preserve">0</m:t>
+        </m:r>
+      </m:oMath>
       <w:r>
         <w:rPr>
           <w:rFonts w:ascii="Times New Roman" w:hAnsi="Times New Roman" w:eastAsia="宋体"/>
@@ -3156,15 +4171,14 @@
         </w:rPr>
         <w:t xml:space="preserve"> 需要外部提示 </w:t>
       </w:r>
-      <w:r>
-        <w:rPr>
-          <w:rFonts w:ascii="Times New Roman" w:hAnsi="Times New Roman" w:eastAsia="宋体"/>
-          <w:b w:val="0"/>
-          <w:i/>
-          <w:sz w:val="24"/>
-        </w:rPr>
-        <w:t>p</w:t>
-      </w:r>
+      <m:oMath>
+        <m:r>
+          <m:rPr>
+            <m:sty m:val="i"/>
+          </m:rPr>
+          <m:t xml:space="preserve">p</m:t>
+        </m:r>
+      </m:oMath>
       <w:r>
         <w:rPr>
           <w:rFonts w:ascii="Times New Roman" w:hAnsi="Times New Roman" w:eastAsia="宋体"/>
@@ -3174,15 +4188,26 @@
         </w:rPr>
         <w:t>；</w:t>
       </w:r>
-      <w:r>
-        <w:rPr>
-          <w:rFonts w:ascii="Times New Roman" w:hAnsi="Times New Roman" w:eastAsia="宋体"/>
-          <w:b w:val="0"/>
-          <w:i/>
-          <w:sz w:val="24"/>
-        </w:rPr>
-        <w:t>t&gt;0</w:t>
-      </w:r>
+      <m:oMath>
+        <m:r>
+          <m:rPr>
+            <m:sty m:val="i"/>
+          </m:rPr>
+          <m:t xml:space="preserve">t</m:t>
+        </m:r>
+        <m:r>
+          <m:rPr>
+            <m:sty m:val="p"/>
+          </m:rPr>
+          <m:t xml:space="preserve">&gt;</m:t>
+        </m:r>
+        <m:r>
+          <m:rPr>
+            <m:sty m:val="p"/>
+          </m:rPr>
+          <m:t xml:space="preserve">0</m:t>
+        </m:r>
+      </m:oMath>
       <w:r>
         <w:rPr>
           <w:rFonts w:ascii="Times New Roman" w:hAnsi="Times New Roman" w:eastAsia="宋体"/>
@@ -3296,15 +4321,14 @@
         </w:rPr>
         <w:t xml:space="preserve"> Instead of costly end-to-end training, we first process our entire demonstration dataset </w:t>
       </w:r>
-      <w:r>
-        <w:rPr>
-          <w:rFonts w:ascii="Times New Roman" w:hAnsi="Times New Roman" w:eastAsia="宋体"/>
-          <w:b w:val="0"/>
-          <w:i/>
-          <w:sz w:val="24"/>
-        </w:rPr>
-        <w:t>D</w:t>
-      </w:r>
+      <m:oMath>
+        <m:r>
+          <m:rPr>
+            <m:sty m:val="i"/>
+          </m:rPr>
+          <m:t xml:space="preserve">D</m:t>
+        </m:r>
+      </m:oMath>
       <w:r>
         <w:rPr>
           <w:rFonts w:ascii="Times New Roman" w:hAnsi="Times New Roman" w:eastAsia="宋体"/>
@@ -3314,15 +4338,74 @@
         </w:rPr>
         <w:t xml:space="preserve"> in an offline pass. For each demonstration, we provide the video frames </w:t>
       </w:r>
-      <w:r>
-        <w:rPr>
-          <w:rFonts w:ascii="Times New Roman" w:hAnsi="Times New Roman" w:eastAsia="宋体"/>
-          <w:b w:val="0"/>
-          <w:i/>
-          <w:sz w:val="24"/>
-        </w:rPr>
-        <w:t>(I_0, \ldots, I_T)</w:t>
-      </w:r>
+      <m:oMath>
+        <m:r>
+          <m:rPr>
+            <m:sty m:val="p"/>
+          </m:rPr>
+          <m:t xml:space="preserve">(</m:t>
+        </m:r>
+        <m:sSub>
+          <m:e>
+            <m:r>
+              <m:rPr>
+                <m:sty m:val="i"/>
+              </m:rPr>
+              <m:t xml:space="preserve">I</m:t>
+            </m:r>
+          </m:e>
+          <m:sub>
+            <m:r>
+              <m:rPr>
+                <m:sty m:val="p"/>
+              </m:rPr>
+              <m:t xml:space="preserve">0,</m:t>
+            </m:r>
+          </m:sub>
+        </m:sSub>
+        <m:r>
+          <m:rPr>
+            <m:sty m:val="p"/>
+          </m:rPr>
+          <m:t xml:space="preserve"> </m:t>
+        </m:r>
+        <m:r>
+          <m:rPr>
+            <m:sty m:val="p"/>
+          </m:rPr>
+          <m:t xml:space="preserve">…</m:t>
+        </m:r>
+        <m:r>
+          <m:rPr>
+            <m:sty m:val="p"/>
+          </m:rPr>
+          <m:t xml:space="preserve">,</m:t>
+        </m:r>
+        <m:r>
+          <m:rPr>
+            <m:sty m:val="p"/>
+          </m:rPr>
+          <m:t xml:space="preserve"> </m:t>
+        </m:r>
+        <m:sSub>
+          <m:e>
+            <m:r>
+              <m:rPr>
+                <m:sty m:val="i"/>
+              </m:rPr>
+              <m:t xml:space="preserve">I</m:t>
+            </m:r>
+          </m:e>
+          <m:sub>
+            <m:r>
+              <m:rPr>
+                <m:sty m:val="i"/>
+              </m:rPr>
+              <m:t xml:space="preserve">T</m:t>
+            </m:r>
+          </m:sub>
+        </m:sSub>
+      </m:oMath>
       <w:r>
         <w:rPr>
           <w:rFonts w:ascii="Times New Roman" w:hAnsi="Times New Roman" w:eastAsia="宋体"/>
@@ -3332,15 +4415,14 @@
         </w:rPr>
         <w:t xml:space="preserve"> and the corresponding initial prompt </w:t>
       </w:r>
-      <w:r>
-        <w:rPr>
-          <w:rFonts w:ascii="Times New Roman" w:hAnsi="Times New Roman" w:eastAsia="宋体"/>
-          <w:b w:val="0"/>
-          <w:i/>
-          <w:sz w:val="24"/>
-        </w:rPr>
-        <w:t>p</w:t>
-      </w:r>
+      <m:oMath>
+        <m:r>
+          <m:rPr>
+            <m:sty m:val="i"/>
+          </m:rPr>
+          <m:t xml:space="preserve">p</m:t>
+        </m:r>
+      </m:oMath>
       <w:r>
         <w:rPr>
           <w:rFonts w:ascii="Times New Roman" w:hAnsi="Times New Roman" w:eastAsia="宋体"/>
@@ -3350,15 +4432,74 @@
         </w:rPr>
         <w:t xml:space="preserve"> to the frozen SAM2 model. We then save the resulting sequence of intermediate features </w:t>
       </w:r>
-      <w:r>
-        <w:rPr>
-          <w:rFonts w:ascii="Times New Roman" w:hAnsi="Times New Roman" w:eastAsia="宋体"/>
-          <w:b w:val="0"/>
-          <w:i/>
-          <w:sz w:val="24"/>
-        </w:rPr>
-        <w:t>(F_0, \ldots, F_T)</w:t>
-      </w:r>
+      <m:oMath>
+        <m:r>
+          <m:rPr>
+            <m:sty m:val="p"/>
+          </m:rPr>
+          <m:t xml:space="preserve">(</m:t>
+        </m:r>
+        <m:sSub>
+          <m:e>
+            <m:r>
+              <m:rPr>
+                <m:sty m:val="i"/>
+              </m:rPr>
+              <m:t xml:space="preserve">F</m:t>
+            </m:r>
+          </m:e>
+          <m:sub>
+            <m:r>
+              <m:rPr>
+                <m:sty m:val="p"/>
+              </m:rPr>
+              <m:t xml:space="preserve">0,</m:t>
+            </m:r>
+          </m:sub>
+        </m:sSub>
+        <m:r>
+          <m:rPr>
+            <m:sty m:val="p"/>
+          </m:rPr>
+          <m:t xml:space="preserve"> </m:t>
+        </m:r>
+        <m:r>
+          <m:rPr>
+            <m:sty m:val="p"/>
+          </m:rPr>
+          <m:t xml:space="preserve">…</m:t>
+        </m:r>
+        <m:r>
+          <m:rPr>
+            <m:sty m:val="p"/>
+          </m:rPr>
+          <m:t xml:space="preserve">,</m:t>
+        </m:r>
+        <m:r>
+          <m:rPr>
+            <m:sty m:val="p"/>
+          </m:rPr>
+          <m:t xml:space="preserve"> </m:t>
+        </m:r>
+        <m:sSub>
+          <m:e>
+            <m:r>
+              <m:rPr>
+                <m:sty m:val="i"/>
+              </m:rPr>
+              <m:t xml:space="preserve">F</m:t>
+            </m:r>
+          </m:e>
+          <m:sub>
+            <m:r>
+              <m:rPr>
+                <m:sty m:val="i"/>
+              </m:rPr>
+              <m:t xml:space="preserve">T</m:t>
+            </m:r>
+          </m:sub>
+        </m:sSub>
+      </m:oMath>
       <w:r>
         <w:rPr>
           <w:rFonts w:ascii="Times New Roman" w:hAnsi="Times New Roman" w:eastAsia="宋体"/>
@@ -3368,15 +4509,106 @@
         </w:rPr>
         <w:t xml:space="preserve"> to disk. This step creates a new, pre-processed dataset </w:t>
       </w:r>
-      <w:r>
-        <w:rPr>
-          <w:rFonts w:ascii="Times New Roman" w:hAnsi="Times New Roman" w:eastAsia="宋体"/>
-          <w:b w:val="0"/>
-          <w:i/>
-          <w:sz w:val="24"/>
-        </w:rPr>
-        <w:t>D' = \{(F_t, a^*_t)\}</w:t>
-      </w:r>
+      <m:oMath>
+        <m:r>
+          <m:rPr>
+            <m:sty m:val="i"/>
+          </m:rPr>
+          <m:t xml:space="preserve">D</m:t>
+        </m:r>
+        <m:r>
+          <m:rPr>
+            <m:sty m:val="p"/>
+          </m:rPr>
+          <m:t xml:space="preserve">'</m:t>
+        </m:r>
+        <m:r>
+          <m:rPr>
+            <m:sty m:val="p"/>
+          </m:rPr>
+          <m:t xml:space="preserve"> </m:t>
+        </m:r>
+        <m:r>
+          <m:rPr>
+            <m:sty m:val="p"/>
+          </m:rPr>
+          <m:t xml:space="preserve">=</m:t>
+        </m:r>
+        <m:r>
+          <m:rPr>
+            <m:sty m:val="p"/>
+          </m:rPr>
+          <m:t xml:space="preserve"> </m:t>
+        </m:r>
+        <m:r>
+          <m:rPr>
+            <m:sty m:val="p"/>
+          </m:rPr>
+          <m:t xml:space="preserve">{</m:t>
+        </m:r>
+        <m:r>
+          <m:rPr>
+            <m:sty m:val="p"/>
+          </m:rPr>
+          <m:t xml:space="preserve">(</m:t>
+        </m:r>
+        <m:sSub>
+          <m:e>
+            <m:r>
+              <m:rPr>
+                <m:sty m:val="i"/>
+              </m:rPr>
+              <m:t xml:space="preserve">F</m:t>
+            </m:r>
+          </m:e>
+          <m:sub>
+            <m:r>
+              <m:rPr>
+                <m:sty m:val="i"/>
+              </m:rPr>
+              <m:t xml:space="preserve">t</m:t>
+            </m:r>
+          </m:sub>
+        </m:sSub>
+        <m:r>
+          <m:rPr>
+            <m:sty m:val="p"/>
+          </m:rPr>
+          <m:t xml:space="preserve">,</m:t>
+        </m:r>
+        <m:r>
+          <m:rPr>
+            <m:sty m:val="p"/>
+          </m:rPr>
+          <m:t xml:space="preserve"> </m:t>
+        </m:r>
+        <m:sSubSup>
+          <m:e>
+            <m:r>
+              <m:rPr>
+                <m:sty m:val="i"/>
+              </m:rPr>
+              <m:t xml:space="preserve">a</m:t>
+            </m:r>
+          </m:e>
+          <m:sub>
+            <m:r>
+              <m:rPr>
+                <m:sty m:val="i"/>
+              </m:rPr>
+              <m:t xml:space="preserve">t</m:t>
+            </m:r>
+          </m:sub>
+          <m:sup>
+            <m:r>
+              <m:rPr>
+                <m:sty m:val="p"/>
+              </m:rPr>
+              <m:t xml:space="preserve">*</m:t>
+            </m:r>
+          </m:sup>
+        </m:sSubSup>
+      </m:oMath>
       <w:r>
         <w:rPr>
           <w:rFonts w:ascii="Times New Roman" w:hAnsi="Times New Roman" w:eastAsia="宋体"/>
@@ -3428,15 +4660,14 @@
         </w:rPr>
         <w:t xml:space="preserve"> 不进行昂贵端到端训练，先对整集演示 </w:t>
       </w:r>
-      <w:r>
-        <w:rPr>
-          <w:rFonts w:ascii="Times New Roman" w:hAnsi="Times New Roman" w:eastAsia="宋体"/>
-          <w:b w:val="0"/>
-          <w:i/>
-          <w:sz w:val="24"/>
-        </w:rPr>
-        <w:t>D</w:t>
-      </w:r>
+      <m:oMath>
+        <m:r>
+          <m:rPr>
+            <m:sty m:val="i"/>
+          </m:rPr>
+          <m:t xml:space="preserve">D</m:t>
+        </m:r>
+      </m:oMath>
       <w:r>
         <w:rPr>
           <w:rFonts w:ascii="Times New Roman" w:hAnsi="Times New Roman" w:eastAsia="宋体"/>
@@ -3446,15 +4677,62 @@
         </w:rPr>
         <w:t xml:space="preserve"> 做离线前向：对每条演示将帧 </w:t>
       </w:r>
-      <w:r>
-        <w:rPr>
-          <w:rFonts w:ascii="Times New Roman" w:hAnsi="Times New Roman" w:eastAsia="宋体"/>
-          <w:b w:val="0"/>
-          <w:i/>
-          <w:sz w:val="24"/>
-        </w:rPr>
-        <w:t>(I_0,\ldots,I_T)</w:t>
-      </w:r>
+      <m:oMath>
+        <m:r>
+          <m:rPr>
+            <m:sty m:val="p"/>
+          </m:rPr>
+          <m:t xml:space="preserve">(</m:t>
+        </m:r>
+        <m:sSub>
+          <m:e>
+            <m:r>
+              <m:rPr>
+                <m:sty m:val="i"/>
+              </m:rPr>
+              <m:t xml:space="preserve">I</m:t>
+            </m:r>
+          </m:e>
+          <m:sub>
+            <m:r>
+              <m:rPr>
+                <m:sty m:val="p"/>
+              </m:rPr>
+              <m:t xml:space="preserve">0,</m:t>
+            </m:r>
+          </m:sub>
+        </m:sSub>
+        <m:r>
+          <m:rPr>
+            <m:sty m:val="p"/>
+          </m:rPr>
+          <m:t xml:space="preserve">…</m:t>
+        </m:r>
+        <m:r>
+          <m:rPr>
+            <m:sty m:val="p"/>
+          </m:rPr>
+          <m:t xml:space="preserve">,</m:t>
+        </m:r>
+        <m:sSub>
+          <m:e>
+            <m:r>
+              <m:rPr>
+                <m:sty m:val="i"/>
+              </m:rPr>
+              <m:t xml:space="preserve">I</m:t>
+            </m:r>
+          </m:e>
+          <m:sub>
+            <m:r>
+              <m:rPr>
+                <m:sty m:val="i"/>
+              </m:rPr>
+              <m:t xml:space="preserve">T</m:t>
+            </m:r>
+          </m:sub>
+        </m:sSub>
+      </m:oMath>
       <w:r>
         <w:rPr>
           <w:rFonts w:ascii="Times New Roman" w:hAnsi="Times New Roman" w:eastAsia="宋体"/>
@@ -3464,15 +4742,14 @@
         </w:rPr>
         <w:t xml:space="preserve"> 与初始提示 </w:t>
       </w:r>
-      <w:r>
-        <w:rPr>
-          <w:rFonts w:ascii="Times New Roman" w:hAnsi="Times New Roman" w:eastAsia="宋体"/>
-          <w:b w:val="0"/>
-          <w:i/>
-          <w:sz w:val="24"/>
-        </w:rPr>
-        <w:t>p</w:t>
-      </w:r>
+      <m:oMath>
+        <m:r>
+          <m:rPr>
+            <m:sty m:val="i"/>
+          </m:rPr>
+          <m:t xml:space="preserve">p</m:t>
+        </m:r>
+      </m:oMath>
       <w:r>
         <w:rPr>
           <w:rFonts w:ascii="Times New Roman" w:hAnsi="Times New Roman" w:eastAsia="宋体"/>
@@ -3482,15 +4759,62 @@
         </w:rPr>
         <w:t xml:space="preserve"> 送入冻结 SAM2，把中间特征序列 </w:t>
       </w:r>
-      <w:r>
-        <w:rPr>
-          <w:rFonts w:ascii="Times New Roman" w:hAnsi="Times New Roman" w:eastAsia="宋体"/>
-          <w:b w:val="0"/>
-          <w:i/>
-          <w:sz w:val="24"/>
-        </w:rPr>
-        <w:t>(F_0,\ldots,F_T)</w:t>
-      </w:r>
+      <m:oMath>
+        <m:r>
+          <m:rPr>
+            <m:sty m:val="p"/>
+          </m:rPr>
+          <m:t xml:space="preserve">(</m:t>
+        </m:r>
+        <m:sSub>
+          <m:e>
+            <m:r>
+              <m:rPr>
+                <m:sty m:val="i"/>
+              </m:rPr>
+              <m:t xml:space="preserve">F</m:t>
+            </m:r>
+          </m:e>
+          <m:sub>
+            <m:r>
+              <m:rPr>
+                <m:sty m:val="p"/>
+              </m:rPr>
+              <m:t xml:space="preserve">0,</m:t>
+            </m:r>
+          </m:sub>
+        </m:sSub>
+        <m:r>
+          <m:rPr>
+            <m:sty m:val="p"/>
+          </m:rPr>
+          <m:t xml:space="preserve">…</m:t>
+        </m:r>
+        <m:r>
+          <m:rPr>
+            <m:sty m:val="p"/>
+          </m:rPr>
+          <m:t xml:space="preserve">,</m:t>
+        </m:r>
+        <m:sSub>
+          <m:e>
+            <m:r>
+              <m:rPr>
+                <m:sty m:val="i"/>
+              </m:rPr>
+              <m:t xml:space="preserve">F</m:t>
+            </m:r>
+          </m:e>
+          <m:sub>
+            <m:r>
+              <m:rPr>
+                <m:sty m:val="i"/>
+              </m:rPr>
+              <m:t xml:space="preserve">T</m:t>
+            </m:r>
+          </m:sub>
+        </m:sSub>
+      </m:oMath>
       <w:r>
         <w:rPr>
           <w:rFonts w:ascii="Times New Roman" w:hAnsi="Times New Roman" w:eastAsia="宋体"/>
@@ -3500,15 +4824,88 @@
         </w:rPr>
         <w:t xml:space="preserve"> 存盘，得到预处理数据集 </w:t>
       </w:r>
-      <w:r>
-        <w:rPr>
-          <w:rFonts w:ascii="Times New Roman" w:hAnsi="Times New Roman" w:eastAsia="宋体"/>
-          <w:b w:val="0"/>
-          <w:i/>
-          <w:sz w:val="24"/>
-        </w:rPr>
-        <w:t>D'=\{(F_t,a^*_t)\}</w:t>
-      </w:r>
+      <m:oMath>
+        <m:r>
+          <m:rPr>
+            <m:sty m:val="i"/>
+          </m:rPr>
+          <m:t xml:space="preserve">D</m:t>
+        </m:r>
+        <m:r>
+          <m:rPr>
+            <m:sty m:val="p"/>
+          </m:rPr>
+          <m:t xml:space="preserve">'</m:t>
+        </m:r>
+        <m:r>
+          <m:rPr>
+            <m:sty m:val="p"/>
+          </m:rPr>
+          <m:t xml:space="preserve">=</m:t>
+        </m:r>
+        <m:r>
+          <m:rPr>
+            <m:sty m:val="p"/>
+          </m:rPr>
+          <m:t xml:space="preserve">{</m:t>
+        </m:r>
+        <m:r>
+          <m:rPr>
+            <m:sty m:val="p"/>
+          </m:rPr>
+          <m:t xml:space="preserve">(</m:t>
+        </m:r>
+        <m:sSub>
+          <m:e>
+            <m:r>
+              <m:rPr>
+                <m:sty m:val="i"/>
+              </m:rPr>
+              <m:t xml:space="preserve">F</m:t>
+            </m:r>
+          </m:e>
+          <m:sub>
+            <m:r>
+              <m:rPr>
+                <m:sty m:val="i"/>
+              </m:rPr>
+              <m:t xml:space="preserve">t</m:t>
+            </m:r>
+          </m:sub>
+        </m:sSub>
+        <m:r>
+          <m:rPr>
+            <m:sty m:val="p"/>
+          </m:rPr>
+          <m:t xml:space="preserve">,</m:t>
+        </m:r>
+        <m:sSubSup>
+          <m:e>
+            <m:r>
+              <m:rPr>
+                <m:sty m:val="i"/>
+              </m:rPr>
+              <m:t xml:space="preserve">a</m:t>
+            </m:r>
+          </m:e>
+          <m:sub>
+            <m:r>
+              <m:rPr>
+                <m:sty m:val="i"/>
+              </m:rPr>
+              <m:t xml:space="preserve">t</m:t>
+            </m:r>
+          </m:sub>
+          <m:sup>
+            <m:r>
+              <m:rPr>
+                <m:sty m:val="p"/>
+              </m:rPr>
+              <m:t xml:space="preserve">*</m:t>
+            </m:r>
+          </m:sup>
+        </m:sSubSup>
+      </m:oMath>
       <w:r>
         <w:rPr>
           <w:rFonts w:ascii="Times New Roman" w:hAnsi="Times New Roman" w:eastAsia="宋体"/>
@@ -3560,15 +4957,20 @@
         </w:rPr>
         <w:t xml:space="preserve"> With the pre-computed dataset </w:t>
       </w:r>
-      <w:r>
-        <w:rPr>
-          <w:rFonts w:ascii="Times New Roman" w:hAnsi="Times New Roman" w:eastAsia="宋体"/>
-          <w:b w:val="0"/>
-          <w:i/>
-          <w:sz w:val="24"/>
-        </w:rPr>
-        <w:t>D'</w:t>
-      </w:r>
+      <m:oMath>
+        <m:r>
+          <m:rPr>
+            <m:sty m:val="i"/>
+          </m:rPr>
+          <m:t xml:space="preserve">D</m:t>
+        </m:r>
+        <m:r>
+          <m:rPr>
+            <m:sty m:val="p"/>
+          </m:rPr>
+          <m:t xml:space="preserve">'</m:t>
+        </m:r>
+      </m:oMath>
       <w:r>
         <w:rPr>
           <w:rFonts w:ascii="Times New Roman" w:hAnsi="Times New Roman" w:eastAsia="宋体"/>
@@ -3578,15 +4980,14 @@
         </w:rPr>
         <w:t xml:space="preserve">, training becomes a simple supervised learning problem. We train only the parameters </w:t>
       </w:r>
-      <w:r>
-        <w:rPr>
-          <w:rFonts w:ascii="Times New Roman" w:hAnsi="Times New Roman" w:eastAsia="宋体"/>
-          <w:b w:val="0"/>
-          <w:i/>
-          <w:sz w:val="24"/>
-        </w:rPr>
-        <w:t>\theta</w:t>
-      </w:r>
+      <m:oMath>
+        <m:r>
+          <m:rPr>
+            <m:sty m:val="p"/>
+          </m:rPr>
+          <m:t xml:space="preserve">θ</m:t>
+        </m:r>
+      </m:oMath>
       <w:r>
         <w:rPr>
           <w:rFonts w:ascii="Times New Roman" w:hAnsi="Times New Roman" w:eastAsia="宋体"/>
@@ -3596,15 +4997,26 @@
         </w:rPr>
         <w:t xml:space="preserve"> of the action head </w:t>
       </w:r>
-      <w:r>
-        <w:rPr>
-          <w:rFonts w:ascii="Times New Roman" w:hAnsi="Times New Roman" w:eastAsia="宋体"/>
-          <w:b w:val="0"/>
-          <w:i/>
-          <w:sz w:val="24"/>
-        </w:rPr>
-        <w:t>h_{\mathrm{action}}</w:t>
-      </w:r>
+      <m:oMath>
+        <m:sSub>
+          <m:e>
+            <m:r>
+              <m:rPr>
+                <m:sty m:val="i"/>
+              </m:rPr>
+              <m:t xml:space="preserve">h</m:t>
+            </m:r>
+          </m:e>
+          <m:sub>
+            <m:r>
+              <m:rPr>
+                <m:sty m:val="i"/>
+              </m:rPr>
+              <m:t xml:space="preserve">action</m:t>
+            </m:r>
+          </m:sub>
+        </m:sSub>
+      </m:oMath>
       <w:r>
         <w:rPr>
           <w:rFonts w:ascii="Times New Roman" w:hAnsi="Times New Roman" w:eastAsia="宋体"/>
@@ -3614,15 +5026,104 @@
         </w:rPr>
         <w:t xml:space="preserve"> to minimize a regression loss, such as the L2 norm (MSE), between the predicted action </w:t>
       </w:r>
-      <w:r>
-        <w:rPr>
-          <w:rFonts w:ascii="Times New Roman" w:hAnsi="Times New Roman" w:eastAsia="宋体"/>
-          <w:b w:val="0"/>
-          <w:i/>
-          <w:sz w:val="24"/>
-        </w:rPr>
-        <w:t>a_t = h_{\mathrm{action}}(F_t; \theta)</w:t>
-      </w:r>
+      <m:oMath>
+        <m:sSub>
+          <m:e>
+            <m:r>
+              <m:rPr>
+                <m:sty m:val="i"/>
+              </m:rPr>
+              <m:t xml:space="preserve">a</m:t>
+            </m:r>
+          </m:e>
+          <m:sub>
+            <m:r>
+              <m:rPr>
+                <m:sty m:val="i"/>
+              </m:rPr>
+              <m:t xml:space="preserve">t</m:t>
+            </m:r>
+          </m:sub>
+        </m:sSub>
+        <m:r>
+          <m:rPr>
+            <m:sty m:val="p"/>
+          </m:rPr>
+          <m:t xml:space="preserve"> </m:t>
+        </m:r>
+        <m:r>
+          <m:rPr>
+            <m:sty m:val="p"/>
+          </m:rPr>
+          <m:t xml:space="preserve">=</m:t>
+        </m:r>
+        <m:r>
+          <m:rPr>
+            <m:sty m:val="p"/>
+          </m:rPr>
+          <m:t xml:space="preserve"> </m:t>
+        </m:r>
+        <m:sSub>
+          <m:e>
+            <m:r>
+              <m:rPr>
+                <m:sty m:val="i"/>
+              </m:rPr>
+              <m:t xml:space="preserve">h</m:t>
+            </m:r>
+          </m:e>
+          <m:sub>
+            <m:r>
+              <m:rPr>
+                <m:sty m:val="i"/>
+              </m:rPr>
+              <m:t xml:space="preserve">action</m:t>
+            </m:r>
+          </m:sub>
+        </m:sSub>
+        <m:r>
+          <m:rPr>
+            <m:sty m:val="p"/>
+          </m:rPr>
+          <m:t xml:space="preserve">(</m:t>
+        </m:r>
+        <m:sSub>
+          <m:e>
+            <m:r>
+              <m:rPr>
+                <m:sty m:val="i"/>
+              </m:rPr>
+              <m:t xml:space="preserve">F</m:t>
+            </m:r>
+          </m:e>
+          <m:sub>
+            <m:r>
+              <m:rPr>
+                <m:sty m:val="i"/>
+              </m:rPr>
+              <m:t xml:space="preserve">t</m:t>
+            </m:r>
+          </m:sub>
+        </m:sSub>
+        <m:r>
+          <m:rPr>
+            <m:sty m:val="p"/>
+          </m:rPr>
+          <m:t xml:space="preserve">;</m:t>
+        </m:r>
+        <m:r>
+          <m:rPr>
+            <m:sty m:val="p"/>
+          </m:rPr>
+          <m:t xml:space="preserve"> </m:t>
+        </m:r>
+        <m:r>
+          <m:rPr>
+            <m:sty m:val="p"/>
+          </m:rPr>
+          <m:t xml:space="preserve">θ</m:t>
+        </m:r>
+      </m:oMath>
       <w:r>
         <w:rPr>
           <w:rFonts w:ascii="Times New Roman" w:hAnsi="Times New Roman" w:eastAsia="宋体"/>
@@ -3632,15 +5133,34 @@
         </w:rPr>
         <w:t xml:space="preserve"> and the ground-truth expert action </w:t>
       </w:r>
-      <w:r>
-        <w:rPr>
-          <w:rFonts w:ascii="Times New Roman" w:hAnsi="Times New Roman" w:eastAsia="宋体"/>
-          <w:b w:val="0"/>
-          <w:i/>
-          <w:sz w:val="24"/>
-        </w:rPr>
-        <w:t>a^*_t</w:t>
-      </w:r>
+      <m:oMath>
+        <m:sSubSup>
+          <m:e>
+            <m:r>
+              <m:rPr>
+                <m:sty m:val="i"/>
+              </m:rPr>
+              <m:t xml:space="preserve">a</m:t>
+            </m:r>
+          </m:e>
+          <m:sub>
+            <m:r>
+              <m:rPr>
+                <m:sty m:val="i"/>
+              </m:rPr>
+              <m:t xml:space="preserve">t</m:t>
+            </m:r>
+          </m:sub>
+          <m:sup>
+            <m:r>
+              <m:rPr>
+                <m:sty m:val="p"/>
+              </m:rPr>
+              <m:t xml:space="preserve">*</m:t>
+            </m:r>
+          </m:sup>
+        </m:sSubSup>
+      </m:oMath>
       <w:r>
         <w:rPr>
           <w:rFonts w:ascii="Times New Roman" w:hAnsi="Times New Roman" w:eastAsia="宋体"/>
@@ -3656,15 +5176,34 @@
         <w:spacing w:line="360" w:lineRule="auto" w:after="120" w:before="0"/>
         <w:jc w:val="center"/>
       </w:pPr>
-      <w:r>
-        <w:rPr>
-          <w:rFonts w:ascii="Times New Roman" w:hAnsi="Times New Roman" w:eastAsia="宋体"/>
-          <w:b w:val="0"/>
-          <w:i/>
-          <w:sz w:val="24"/>
-        </w:rPr>
-        <w:t>\mathcal{L}(\theta) = \frac{1}{N} \sum_{t=1}^{N} \left\| h_{\mathrm{action}}(F_t; \theta) - a^*_t \right\|_2^2 \tag{1}</w:t>
-      </w:r>
+      <m:oMathPara>
+        <m:oMath>
+          <m:r>
+            <m:rPr>
+              <m:sty m:val="p"/>
+            </m:rPr>
+            <m:t xml:space="preserve">\mathcal</m:t>
+          </m:r>
+          <m:r>
+            <m:rPr>
+              <m:sty m:val="i"/>
+            </m:rPr>
+            <m:t xml:space="preserve">L</m:t>
+          </m:r>
+          <m:r>
+            <m:rPr>
+              <m:sty m:val="p"/>
+            </m:rPr>
+            <m:t xml:space="preserve">(</m:t>
+          </m:r>
+          <m:r>
+            <m:rPr>
+              <m:sty m:val="p"/>
+            </m:rPr>
+            <m:t xml:space="preserve">θ</m:t>
+          </m:r>
+        </m:oMath>
+      </m:oMathPara>
     </w:p>
     <w:p>
       <w:pPr>
@@ -3707,15 +5246,20 @@
         </w:rPr>
         <w:t xml:space="preserve"> 在预计算数据集 </w:t>
       </w:r>
-      <w:r>
-        <w:rPr>
-          <w:rFonts w:ascii="Times New Roman" w:hAnsi="Times New Roman" w:eastAsia="宋体"/>
-          <w:b w:val="0"/>
-          <w:i/>
-          <w:sz w:val="24"/>
-        </w:rPr>
-        <w:t>D'</w:t>
-      </w:r>
+      <m:oMath>
+        <m:r>
+          <m:rPr>
+            <m:sty m:val="i"/>
+          </m:rPr>
+          <m:t xml:space="preserve">D</m:t>
+        </m:r>
+        <m:r>
+          <m:rPr>
+            <m:sty m:val="p"/>
+          </m:rPr>
+          <m:t xml:space="preserve">'</m:t>
+        </m:r>
+      </m:oMath>
       <w:r>
         <w:rPr>
           <w:rFonts w:ascii="Times New Roman" w:hAnsi="Times New Roman" w:eastAsia="宋体"/>
@@ -3725,15 +5269,26 @@
         </w:rPr>
         <w:t xml:space="preserve"> 上，训练退化为简单监督学习：只训练动作头 </w:t>
       </w:r>
-      <w:r>
-        <w:rPr>
-          <w:rFonts w:ascii="Times New Roman" w:hAnsi="Times New Roman" w:eastAsia="宋体"/>
-          <w:b w:val="0"/>
-          <w:i/>
-          <w:sz w:val="24"/>
-        </w:rPr>
-        <w:t>h_{\mathrm{action}}</w:t>
-      </w:r>
+      <m:oMath>
+        <m:sSub>
+          <m:e>
+            <m:r>
+              <m:rPr>
+                <m:sty m:val="i"/>
+              </m:rPr>
+              <m:t xml:space="preserve">h</m:t>
+            </m:r>
+          </m:e>
+          <m:sub>
+            <m:r>
+              <m:rPr>
+                <m:sty m:val="i"/>
+              </m:rPr>
+              <m:t xml:space="preserve">action</m:t>
+            </m:r>
+          </m:sub>
+        </m:sSub>
+      </m:oMath>
       <w:r>
         <w:rPr>
           <w:rFonts w:ascii="Times New Roman" w:hAnsi="Times New Roman" w:eastAsia="宋体"/>
@@ -3743,15 +5298,14 @@
         </w:rPr>
         <w:t xml:space="preserve"> 的参数 </w:t>
       </w:r>
-      <w:r>
-        <w:rPr>
-          <w:rFonts w:ascii="Times New Roman" w:hAnsi="Times New Roman" w:eastAsia="宋体"/>
-          <w:b w:val="0"/>
-          <w:i/>
-          <w:sz w:val="24"/>
-        </w:rPr>
-        <w:t>\theta</w:t>
-      </w:r>
+      <m:oMath>
+        <m:r>
+          <m:rPr>
+            <m:sty m:val="p"/>
+          </m:rPr>
+          <m:t xml:space="preserve">θ</m:t>
+        </m:r>
+      </m:oMath>
       <w:r>
         <w:rPr>
           <w:rFonts w:ascii="Times New Roman" w:hAnsi="Times New Roman" w:eastAsia="宋体"/>
@@ -3761,15 +5315,86 @@
         </w:rPr>
         <w:t xml:space="preserve">，最小化预测动作 </w:t>
       </w:r>
-      <w:r>
-        <w:rPr>
-          <w:rFonts w:ascii="Times New Roman" w:hAnsi="Times New Roman" w:eastAsia="宋体"/>
-          <w:b w:val="0"/>
-          <w:i/>
-          <w:sz w:val="24"/>
-        </w:rPr>
-        <w:t>a_t=h_{\mathrm{action}}(F_t;\theta)</w:t>
-      </w:r>
+      <m:oMath>
+        <m:sSub>
+          <m:e>
+            <m:r>
+              <m:rPr>
+                <m:sty m:val="i"/>
+              </m:rPr>
+              <m:t xml:space="preserve">a</m:t>
+            </m:r>
+          </m:e>
+          <m:sub>
+            <m:r>
+              <m:rPr>
+                <m:sty m:val="i"/>
+              </m:rPr>
+              <m:t xml:space="preserve">t</m:t>
+            </m:r>
+          </m:sub>
+        </m:sSub>
+        <m:r>
+          <m:rPr>
+            <m:sty m:val="p"/>
+          </m:rPr>
+          <m:t xml:space="preserve">=</m:t>
+        </m:r>
+        <m:sSub>
+          <m:e>
+            <m:r>
+              <m:rPr>
+                <m:sty m:val="i"/>
+              </m:rPr>
+              <m:t xml:space="preserve">h</m:t>
+            </m:r>
+          </m:e>
+          <m:sub>
+            <m:r>
+              <m:rPr>
+                <m:sty m:val="i"/>
+              </m:rPr>
+              <m:t xml:space="preserve">action</m:t>
+            </m:r>
+          </m:sub>
+        </m:sSub>
+        <m:r>
+          <m:rPr>
+            <m:sty m:val="p"/>
+          </m:rPr>
+          <m:t xml:space="preserve">(</m:t>
+        </m:r>
+        <m:sSub>
+          <m:e>
+            <m:r>
+              <m:rPr>
+                <m:sty m:val="i"/>
+              </m:rPr>
+              <m:t xml:space="preserve">F</m:t>
+            </m:r>
+          </m:e>
+          <m:sub>
+            <m:r>
+              <m:rPr>
+                <m:sty m:val="i"/>
+              </m:rPr>
+              <m:t xml:space="preserve">t</m:t>
+            </m:r>
+          </m:sub>
+        </m:sSub>
+        <m:r>
+          <m:rPr>
+            <m:sty m:val="p"/>
+          </m:rPr>
+          <m:t xml:space="preserve">;</m:t>
+        </m:r>
+        <m:r>
+          <m:rPr>
+            <m:sty m:val="p"/>
+          </m:rPr>
+          <m:t xml:space="preserve">θ</m:t>
+        </m:r>
+      </m:oMath>
       <w:r>
         <w:rPr>
           <w:rFonts w:ascii="Times New Roman" w:hAnsi="Times New Roman" w:eastAsia="宋体"/>
@@ -3779,15 +5404,34 @@
         </w:rPr>
         <w:t xml:space="preserve"> 与专家动作 </w:t>
       </w:r>
-      <w:r>
-        <w:rPr>
-          <w:rFonts w:ascii="Times New Roman" w:hAnsi="Times New Roman" w:eastAsia="宋体"/>
-          <w:b w:val="0"/>
-          <w:i/>
-          <w:sz w:val="24"/>
-        </w:rPr>
-        <w:t>a^*_t</w:t>
-      </w:r>
+      <m:oMath>
+        <m:sSubSup>
+          <m:e>
+            <m:r>
+              <m:rPr>
+                <m:sty m:val="i"/>
+              </m:rPr>
+              <m:t xml:space="preserve">a</m:t>
+            </m:r>
+          </m:e>
+          <m:sub>
+            <m:r>
+              <m:rPr>
+                <m:sty m:val="i"/>
+              </m:rPr>
+              <m:t xml:space="preserve">t</m:t>
+            </m:r>
+          </m:sub>
+          <m:sup>
+            <m:r>
+              <m:rPr>
+                <m:sty m:val="p"/>
+              </m:rPr>
+              <m:t xml:space="preserve">*</m:t>
+            </m:r>
+          </m:sup>
+        </m:sSubSup>
+      </m:oMath>
       <w:r>
         <w:rPr>
           <w:rFonts w:ascii="Times New Roman" w:hAnsi="Times New Roman" w:eastAsia="宋体"/>
@@ -4183,15 +5827,50 @@
         </w:rPr>
         <w:t xml:space="preserve"> Operating at a moderate rate (e.g., </w:t>
       </w:r>
-      <w:r>
-        <w:rPr>
-          <w:rFonts w:ascii="Times New Roman" w:hAnsi="Times New Roman" w:eastAsia="宋体"/>
-          <w:b w:val="0"/>
-          <w:i/>
-          <w:sz w:val="24"/>
-        </w:rPr>
-        <w:t>f_p \approx 20</w:t>
-      </w:r>
+      <m:oMath>
+        <m:sSub>
+          <m:e>
+            <m:r>
+              <m:rPr>
+                <m:sty m:val="i"/>
+              </m:rPr>
+              <m:t xml:space="preserve">f</m:t>
+            </m:r>
+          </m:e>
+          <m:sub>
+            <m:r>
+              <m:rPr>
+                <m:sty m:val="i"/>
+              </m:rPr>
+              <m:t xml:space="preserve">p</m:t>
+            </m:r>
+          </m:sub>
+        </m:sSub>
+        <m:r>
+          <m:rPr>
+            <m:sty m:val="p"/>
+          </m:rPr>
+          <m:t xml:space="preserve"> </m:t>
+        </m:r>
+        <m:r>
+          <m:rPr>
+            <m:sty m:val="p"/>
+          </m:rPr>
+          <m:t xml:space="preserve">≈</m:t>
+        </m:r>
+        <m:r>
+          <m:rPr>
+            <m:sty m:val="p"/>
+          </m:rPr>
+          <m:t xml:space="preserve"> </m:t>
+        </m:r>
+        <m:r>
+          <m:rPr>
+            <m:sty m:val="p"/>
+          </m:rPr>
+          <m:t xml:space="preserve">20</m:t>
+        </m:r>
+      </m:oMath>
       <w:r>
         <w:rPr>
           <w:rFonts w:ascii="Times New Roman" w:hAnsi="Times New Roman" w:eastAsia="宋体"/>
@@ -4201,15 +5880,26 @@
         </w:rPr>
         <w:t xml:space="preserve"> Hz), this thread periodically acquires the latest camera observation </w:t>
       </w:r>
-      <w:r>
-        <w:rPr>
-          <w:rFonts w:ascii="Times New Roman" w:hAnsi="Times New Roman" w:eastAsia="宋体"/>
-          <w:b w:val="0"/>
-          <w:i/>
-          <w:sz w:val="24"/>
-        </w:rPr>
-        <w:t>I_t</w:t>
-      </w:r>
+      <m:oMath>
+        <m:sSub>
+          <m:e>
+            <m:r>
+              <m:rPr>
+                <m:sty m:val="i"/>
+              </m:rPr>
+              <m:t xml:space="preserve">I</m:t>
+            </m:r>
+          </m:e>
+          <m:sub>
+            <m:r>
+              <m:rPr>
+                <m:sty m:val="i"/>
+              </m:rPr>
+              <m:t xml:space="preserve">t</m:t>
+            </m:r>
+          </m:sub>
+        </m:sSub>
+      </m:oMath>
       <w:r>
         <w:rPr>
           <w:rFonts w:ascii="Times New Roman" w:hAnsi="Times New Roman" w:eastAsia="宋体"/>
@@ -4219,15 +5909,26 @@
         </w:rPr>
         <w:t xml:space="preserve"> and the robot’s proprioceptive state </w:t>
       </w:r>
-      <w:r>
-        <w:rPr>
-          <w:rFonts w:ascii="Times New Roman" w:hAnsi="Times New Roman" w:eastAsia="宋体"/>
-          <w:b w:val="0"/>
-          <w:i/>
-          <w:sz w:val="24"/>
-        </w:rPr>
-        <w:t>Prop_t</w:t>
-      </w:r>
+      <m:oMath>
+        <m:sSub>
+          <m:e>
+            <m:r>
+              <m:rPr>
+                <m:sty m:val="i"/>
+              </m:rPr>
+              <m:t xml:space="preserve">Prop</m:t>
+            </m:r>
+          </m:e>
+          <m:sub>
+            <m:r>
+              <m:rPr>
+                <m:sty m:val="i"/>
+              </m:rPr>
+              <m:t xml:space="preserve">t</m:t>
+            </m:r>
+          </m:sub>
+        </m:sSub>
+      </m:oMath>
       <w:r>
         <w:rPr>
           <w:rFonts w:ascii="Times New Roman" w:hAnsi="Times New Roman" w:eastAsia="宋体"/>
@@ -4237,15 +5938,26 @@
         </w:rPr>
         <w:t xml:space="preserve">. Images are passed through the frozen SAM2 backbone to obtain the object-centric feature </w:t>
       </w:r>
-      <w:r>
-        <w:rPr>
-          <w:rFonts w:ascii="Times New Roman" w:hAnsi="Times New Roman" w:eastAsia="宋体"/>
-          <w:b w:val="0"/>
-          <w:i/>
-          <w:sz w:val="24"/>
-        </w:rPr>
-        <w:t>F_t</w:t>
-      </w:r>
+      <m:oMath>
+        <m:sSub>
+          <m:e>
+            <m:r>
+              <m:rPr>
+                <m:sty m:val="i"/>
+              </m:rPr>
+              <m:t xml:space="preserve">F</m:t>
+            </m:r>
+          </m:e>
+          <m:sub>
+            <m:r>
+              <m:rPr>
+                <m:sty m:val="i"/>
+              </m:rPr>
+              <m:t xml:space="preserve">t</m:t>
+            </m:r>
+          </m:sub>
+        </m:sSub>
+      </m:oMath>
       <w:r>
         <w:rPr>
           <w:rFonts w:ascii="Times New Roman" w:hAnsi="Times New Roman" w:eastAsia="宋体"/>
@@ -4255,15 +5967,26 @@
         </w:rPr>
         <w:t xml:space="preserve">, which, together with </w:t>
       </w:r>
-      <w:r>
-        <w:rPr>
-          <w:rFonts w:ascii="Times New Roman" w:hAnsi="Times New Roman" w:eastAsia="宋体"/>
-          <w:b w:val="0"/>
-          <w:i/>
-          <w:sz w:val="24"/>
-        </w:rPr>
-        <w:t>Prop_t</w:t>
-      </w:r>
+      <m:oMath>
+        <m:sSub>
+          <m:e>
+            <m:r>
+              <m:rPr>
+                <m:sty m:val="i"/>
+              </m:rPr>
+              <m:t xml:space="preserve">Prop</m:t>
+            </m:r>
+          </m:e>
+          <m:sub>
+            <m:r>
+              <m:rPr>
+                <m:sty m:val="i"/>
+              </m:rPr>
+              <m:t xml:space="preserve">t</m:t>
+            </m:r>
+          </m:sub>
+        </m:sSub>
+      </m:oMath>
       <w:r>
         <w:rPr>
           <w:rFonts w:ascii="Times New Roman" w:hAnsi="Times New Roman" w:eastAsia="宋体"/>
@@ -4273,15 +5996,176 @@
         </w:rPr>
         <w:t xml:space="preserve">, is fed into the ACT-based policy head. The policy outputs a chunk of predicted actions </w:t>
       </w:r>
-      <w:r>
-        <w:rPr>
-          <w:rFonts w:ascii="Times New Roman" w:hAnsi="Times New Roman" w:eastAsia="宋体"/>
-          <w:b w:val="0"/>
-          <w:i/>
-          <w:sz w:val="24"/>
-        </w:rPr>
-        <w:t>A_t = [a_t, a_{t+1}, \ldots, a_{t+K}]</w:t>
-      </w:r>
+      <m:oMath>
+        <m:sSub>
+          <m:e>
+            <m:r>
+              <m:rPr>
+                <m:sty m:val="i"/>
+              </m:rPr>
+              <m:t xml:space="preserve">A</m:t>
+            </m:r>
+          </m:e>
+          <m:sub>
+            <m:r>
+              <m:rPr>
+                <m:sty m:val="i"/>
+              </m:rPr>
+              <m:t xml:space="preserve">t</m:t>
+            </m:r>
+          </m:sub>
+        </m:sSub>
+        <m:r>
+          <m:rPr>
+            <m:sty m:val="p"/>
+          </m:rPr>
+          <m:t xml:space="preserve"> </m:t>
+        </m:r>
+        <m:r>
+          <m:rPr>
+            <m:sty m:val="p"/>
+          </m:rPr>
+          <m:t xml:space="preserve">=</m:t>
+        </m:r>
+        <m:r>
+          <m:rPr>
+            <m:sty m:val="p"/>
+          </m:rPr>
+          <m:t xml:space="preserve"> </m:t>
+        </m:r>
+        <m:r>
+          <m:rPr>
+            <m:sty m:val="p"/>
+          </m:rPr>
+          <m:t xml:space="preserve">[</m:t>
+        </m:r>
+        <m:sSub>
+          <m:e>
+            <m:r>
+              <m:rPr>
+                <m:sty m:val="i"/>
+              </m:rPr>
+              <m:t xml:space="preserve">a</m:t>
+            </m:r>
+          </m:e>
+          <m:sub>
+            <m:r>
+              <m:rPr>
+                <m:sty m:val="i"/>
+              </m:rPr>
+              <m:t xml:space="preserve">t</m:t>
+            </m:r>
+          </m:sub>
+        </m:sSub>
+        <m:r>
+          <m:rPr>
+            <m:sty m:val="p"/>
+          </m:rPr>
+          <m:t xml:space="preserve">,</m:t>
+        </m:r>
+        <m:r>
+          <m:rPr>
+            <m:sty m:val="p"/>
+          </m:rPr>
+          <m:t xml:space="preserve"> </m:t>
+        </m:r>
+        <m:sSub>
+          <m:e>
+            <m:r>
+              <m:rPr>
+                <m:sty m:val="i"/>
+              </m:rPr>
+              <m:t xml:space="preserve">a</m:t>
+            </m:r>
+          </m:e>
+          <m:sub>
+            <m:r>
+              <m:rPr>
+                <m:sty m:val="i"/>
+              </m:rPr>
+              <m:t xml:space="preserve">t</m:t>
+            </m:r>
+            <m:r>
+              <m:rPr>
+                <m:sty m:val="p"/>
+              </m:rPr>
+              <m:t xml:space="preserve">+</m:t>
+            </m:r>
+            <m:r>
+              <m:rPr>
+                <m:sty m:val="p"/>
+              </m:rPr>
+              <m:t xml:space="preserve">1</m:t>
+            </m:r>
+          </m:sub>
+        </m:sSub>
+        <m:r>
+          <m:rPr>
+            <m:sty m:val="p"/>
+          </m:rPr>
+          <m:t xml:space="preserve">,</m:t>
+        </m:r>
+        <m:r>
+          <m:rPr>
+            <m:sty m:val="p"/>
+          </m:rPr>
+          <m:t xml:space="preserve"> </m:t>
+        </m:r>
+        <m:r>
+          <m:rPr>
+            <m:sty m:val="p"/>
+          </m:rPr>
+          <m:t xml:space="preserve">…</m:t>
+        </m:r>
+        <m:r>
+          <m:rPr>
+            <m:sty m:val="p"/>
+          </m:rPr>
+          <m:t xml:space="preserve">,</m:t>
+        </m:r>
+        <m:r>
+          <m:rPr>
+            <m:sty m:val="p"/>
+          </m:rPr>
+          <m:t xml:space="preserve"> </m:t>
+        </m:r>
+        <m:sSub>
+          <m:e>
+            <m:r>
+              <m:rPr>
+                <m:sty m:val="i"/>
+              </m:rPr>
+              <m:t xml:space="preserve">a</m:t>
+            </m:r>
+          </m:e>
+          <m:sub>
+            <m:r>
+              <m:rPr>
+                <m:sty m:val="i"/>
+              </m:rPr>
+              <m:t xml:space="preserve">t</m:t>
+            </m:r>
+            <m:r>
+              <m:rPr>
+                <m:sty m:val="p"/>
+              </m:rPr>
+              <m:t xml:space="preserve">+</m:t>
+            </m:r>
+            <m:r>
+              <m:rPr>
+                <m:sty m:val="i"/>
+              </m:rPr>
+              <m:t xml:space="preserve">K</m:t>
+            </m:r>
+          </m:sub>
+        </m:sSub>
+        <m:r>
+          <m:rPr>
+            <m:sty m:val="p"/>
+          </m:rPr>
+          <m:t xml:space="preserve">]</m:t>
+        </m:r>
+      </m:oMath>
       <w:r>
         <w:rPr>
           <w:rFonts w:ascii="Times New Roman" w:hAnsi="Times New Roman" w:eastAsia="宋体"/>
@@ -4333,15 +6217,44 @@
         </w:rPr>
         <w:t xml:space="preserve"> 以中等频率运行（如 </w:t>
       </w:r>
-      <w:r>
-        <w:rPr>
-          <w:rFonts w:ascii="Times New Roman" w:hAnsi="Times New Roman" w:eastAsia="宋体"/>
-          <w:b w:val="0"/>
-          <w:i/>
-          <w:sz w:val="24"/>
-        </w:rPr>
-        <w:t>f_p\approx 20</w:t>
-      </w:r>
+      <m:oMath>
+        <m:sSub>
+          <m:e>
+            <m:r>
+              <m:rPr>
+                <m:sty m:val="i"/>
+              </m:rPr>
+              <m:t xml:space="preserve">f</m:t>
+            </m:r>
+          </m:e>
+          <m:sub>
+            <m:r>
+              <m:rPr>
+                <m:sty m:val="i"/>
+              </m:rPr>
+              <m:t xml:space="preserve">p</m:t>
+            </m:r>
+          </m:sub>
+        </m:sSub>
+        <m:r>
+          <m:rPr>
+            <m:sty m:val="p"/>
+          </m:rPr>
+          <m:t xml:space="preserve">≈</m:t>
+        </m:r>
+        <m:r>
+          <m:rPr>
+            <m:sty m:val="p"/>
+          </m:rPr>
+          <m:t xml:space="preserve"> </m:t>
+        </m:r>
+        <m:r>
+          <m:rPr>
+            <m:sty m:val="p"/>
+          </m:rPr>
+          <m:t xml:space="preserve">20</m:t>
+        </m:r>
+      </m:oMath>
       <w:r>
         <w:rPr>
           <w:rFonts w:ascii="Times New Roman" w:hAnsi="Times New Roman" w:eastAsia="宋体"/>
@@ -4351,15 +6264,26 @@
         </w:rPr>
         <w:t xml:space="preserve"> Hz），周期性获取最新相机观测 </w:t>
       </w:r>
-      <w:r>
-        <w:rPr>
-          <w:rFonts w:ascii="Times New Roman" w:hAnsi="Times New Roman" w:eastAsia="宋体"/>
-          <w:b w:val="0"/>
-          <w:i/>
-          <w:sz w:val="24"/>
-        </w:rPr>
-        <w:t>I_t</w:t>
-      </w:r>
+      <m:oMath>
+        <m:sSub>
+          <m:e>
+            <m:r>
+              <m:rPr>
+                <m:sty m:val="i"/>
+              </m:rPr>
+              <m:t xml:space="preserve">I</m:t>
+            </m:r>
+          </m:e>
+          <m:sub>
+            <m:r>
+              <m:rPr>
+                <m:sty m:val="i"/>
+              </m:rPr>
+              <m:t xml:space="preserve">t</m:t>
+            </m:r>
+          </m:sub>
+        </m:sSub>
+      </m:oMath>
       <w:r>
         <w:rPr>
           <w:rFonts w:ascii="Times New Roman" w:hAnsi="Times New Roman" w:eastAsia="宋体"/>
@@ -4369,15 +6293,26 @@
         </w:rPr>
         <w:t xml:space="preserve"> 与本体状态 </w:t>
       </w:r>
-      <w:r>
-        <w:rPr>
-          <w:rFonts w:ascii="Times New Roman" w:hAnsi="Times New Roman" w:eastAsia="宋体"/>
-          <w:b w:val="0"/>
-          <w:i/>
-          <w:sz w:val="24"/>
-        </w:rPr>
-        <w:t>Prop_t</w:t>
-      </w:r>
+      <m:oMath>
+        <m:sSub>
+          <m:e>
+            <m:r>
+              <m:rPr>
+                <m:sty m:val="i"/>
+              </m:rPr>
+              <m:t xml:space="preserve">Prop</m:t>
+            </m:r>
+          </m:e>
+          <m:sub>
+            <m:r>
+              <m:rPr>
+                <m:sty m:val="i"/>
+              </m:rPr>
+              <m:t xml:space="preserve">t</m:t>
+            </m:r>
+          </m:sub>
+        </m:sSub>
+      </m:oMath>
       <w:r>
         <w:rPr>
           <w:rFonts w:ascii="Times New Roman" w:hAnsi="Times New Roman" w:eastAsia="宋体"/>
@@ -4387,15 +6322,26 @@
         </w:rPr>
         <w:t xml:space="preserve">。图像经冻结 SAM2 得到物体中心特征 </w:t>
       </w:r>
-      <w:r>
-        <w:rPr>
-          <w:rFonts w:ascii="Times New Roman" w:hAnsi="Times New Roman" w:eastAsia="宋体"/>
-          <w:b w:val="0"/>
-          <w:i/>
-          <w:sz w:val="24"/>
-        </w:rPr>
-        <w:t>F_t</w:t>
-      </w:r>
+      <m:oMath>
+        <m:sSub>
+          <m:e>
+            <m:r>
+              <m:rPr>
+                <m:sty m:val="i"/>
+              </m:rPr>
+              <m:t xml:space="preserve">F</m:t>
+            </m:r>
+          </m:e>
+          <m:sub>
+            <m:r>
+              <m:rPr>
+                <m:sty m:val="i"/>
+              </m:rPr>
+              <m:t xml:space="preserve">t</m:t>
+            </m:r>
+          </m:sub>
+        </m:sSub>
+      </m:oMath>
       <w:r>
         <w:rPr>
           <w:rFonts w:ascii="Times New Roman" w:hAnsi="Times New Roman" w:eastAsia="宋体"/>
@@ -4405,15 +6351,26 @@
         </w:rPr>
         <w:t xml:space="preserve">，再与 </w:t>
       </w:r>
-      <w:r>
-        <w:rPr>
-          <w:rFonts w:ascii="Times New Roman" w:hAnsi="Times New Roman" w:eastAsia="宋体"/>
-          <w:b w:val="0"/>
-          <w:i/>
-          <w:sz w:val="24"/>
-        </w:rPr>
-        <w:t>Prop_t</w:t>
-      </w:r>
+      <m:oMath>
+        <m:sSub>
+          <m:e>
+            <m:r>
+              <m:rPr>
+                <m:sty m:val="i"/>
+              </m:rPr>
+              <m:t xml:space="preserve">Prop</m:t>
+            </m:r>
+          </m:e>
+          <m:sub>
+            <m:r>
+              <m:rPr>
+                <m:sty m:val="i"/>
+              </m:rPr>
+              <m:t xml:space="preserve">t</m:t>
+            </m:r>
+          </m:sub>
+        </m:sSub>
+      </m:oMath>
       <w:r>
         <w:rPr>
           <w:rFonts w:ascii="Times New Roman" w:hAnsi="Times New Roman" w:eastAsia="宋体"/>
@@ -4423,15 +6380,146 @@
         </w:rPr>
         <w:t xml:space="preserve"> 一起送入 ACT 策略头，输出动作块 </w:t>
       </w:r>
-      <w:r>
-        <w:rPr>
-          <w:rFonts w:ascii="Times New Roman" w:hAnsi="Times New Roman" w:eastAsia="宋体"/>
-          <w:b w:val="0"/>
-          <w:i/>
-          <w:sz w:val="24"/>
-        </w:rPr>
-        <w:t>A_t=[a_t,a_{t+1},\ldots,a_{t+K}]</w:t>
-      </w:r>
+      <m:oMath>
+        <m:sSub>
+          <m:e>
+            <m:r>
+              <m:rPr>
+                <m:sty m:val="i"/>
+              </m:rPr>
+              <m:t xml:space="preserve">A</m:t>
+            </m:r>
+          </m:e>
+          <m:sub>
+            <m:r>
+              <m:rPr>
+                <m:sty m:val="i"/>
+              </m:rPr>
+              <m:t xml:space="preserve">t</m:t>
+            </m:r>
+          </m:sub>
+        </m:sSub>
+        <m:r>
+          <m:rPr>
+            <m:sty m:val="p"/>
+          </m:rPr>
+          <m:t xml:space="preserve">=</m:t>
+        </m:r>
+        <m:r>
+          <m:rPr>
+            <m:sty m:val="p"/>
+          </m:rPr>
+          <m:t xml:space="preserve">[</m:t>
+        </m:r>
+        <m:sSub>
+          <m:e>
+            <m:r>
+              <m:rPr>
+                <m:sty m:val="i"/>
+              </m:rPr>
+              <m:t xml:space="preserve">a</m:t>
+            </m:r>
+          </m:e>
+          <m:sub>
+            <m:r>
+              <m:rPr>
+                <m:sty m:val="i"/>
+              </m:rPr>
+              <m:t xml:space="preserve">t</m:t>
+            </m:r>
+          </m:sub>
+        </m:sSub>
+        <m:r>
+          <m:rPr>
+            <m:sty m:val="p"/>
+          </m:rPr>
+          <m:t xml:space="preserve">,</m:t>
+        </m:r>
+        <m:sSub>
+          <m:e>
+            <m:r>
+              <m:rPr>
+                <m:sty m:val="i"/>
+              </m:rPr>
+              <m:t xml:space="preserve">a</m:t>
+            </m:r>
+          </m:e>
+          <m:sub>
+            <m:r>
+              <m:rPr>
+                <m:sty m:val="i"/>
+              </m:rPr>
+              <m:t xml:space="preserve">t</m:t>
+            </m:r>
+            <m:r>
+              <m:rPr>
+                <m:sty m:val="p"/>
+              </m:rPr>
+              <m:t xml:space="preserve">+</m:t>
+            </m:r>
+            <m:r>
+              <m:rPr>
+                <m:sty m:val="p"/>
+              </m:rPr>
+              <m:t xml:space="preserve">1</m:t>
+            </m:r>
+          </m:sub>
+        </m:sSub>
+        <m:r>
+          <m:rPr>
+            <m:sty m:val="p"/>
+          </m:rPr>
+          <m:t xml:space="preserve">,</m:t>
+        </m:r>
+        <m:r>
+          <m:rPr>
+            <m:sty m:val="p"/>
+          </m:rPr>
+          <m:t xml:space="preserve">…</m:t>
+        </m:r>
+        <m:r>
+          <m:rPr>
+            <m:sty m:val="p"/>
+          </m:rPr>
+          <m:t xml:space="preserve">,</m:t>
+        </m:r>
+        <m:sSub>
+          <m:e>
+            <m:r>
+              <m:rPr>
+                <m:sty m:val="i"/>
+              </m:rPr>
+              <m:t xml:space="preserve">a</m:t>
+            </m:r>
+          </m:e>
+          <m:sub>
+            <m:r>
+              <m:rPr>
+                <m:sty m:val="i"/>
+              </m:rPr>
+              <m:t xml:space="preserve">t</m:t>
+            </m:r>
+            <m:r>
+              <m:rPr>
+                <m:sty m:val="p"/>
+              </m:rPr>
+              <m:t xml:space="preserve">+</m:t>
+            </m:r>
+            <m:r>
+              <m:rPr>
+                <m:sty m:val="i"/>
+              </m:rPr>
+              <m:t xml:space="preserve">K</m:t>
+            </m:r>
+          </m:sub>
+        </m:sSub>
+        <m:r>
+          <m:rPr>
+            <m:sty m:val="p"/>
+          </m:rPr>
+          <m:t xml:space="preserve">]</m:t>
+        </m:r>
+      </m:oMath>
       <w:r>
         <w:rPr>
           <w:rFonts w:ascii="Times New Roman" w:hAnsi="Times New Roman" w:eastAsia="宋体"/>
@@ -4483,15 +6571,50 @@
         </w:rPr>
         <w:t xml:space="preserve"> This thread runs at a high frequency (e.g., </w:t>
       </w:r>
-      <w:r>
-        <w:rPr>
-          <w:rFonts w:ascii="Times New Roman" w:hAnsi="Times New Roman" w:eastAsia="宋体"/>
-          <w:b w:val="0"/>
-          <w:i/>
-          <w:sz w:val="24"/>
-        </w:rPr>
-        <w:t>f_c \approx 100</w:t>
-      </w:r>
+      <m:oMath>
+        <m:sSub>
+          <m:e>
+            <m:r>
+              <m:rPr>
+                <m:sty m:val="i"/>
+              </m:rPr>
+              <m:t xml:space="preserve">f</m:t>
+            </m:r>
+          </m:e>
+          <m:sub>
+            <m:r>
+              <m:rPr>
+                <m:sty m:val="i"/>
+              </m:rPr>
+              <m:t xml:space="preserve">c</m:t>
+            </m:r>
+          </m:sub>
+        </m:sSub>
+        <m:r>
+          <m:rPr>
+            <m:sty m:val="p"/>
+          </m:rPr>
+          <m:t xml:space="preserve"> </m:t>
+        </m:r>
+        <m:r>
+          <m:rPr>
+            <m:sty m:val="p"/>
+          </m:rPr>
+          <m:t xml:space="preserve">≈</m:t>
+        </m:r>
+        <m:r>
+          <m:rPr>
+            <m:sty m:val="p"/>
+          </m:rPr>
+          <m:t xml:space="preserve"> </m:t>
+        </m:r>
+        <m:r>
+          <m:rPr>
+            <m:sty m:val="p"/>
+          </m:rPr>
+          <m:t xml:space="preserve">100</m:t>
+        </m:r>
+      </m:oMath>
       <w:r>
         <w:rPr>
           <w:rFonts w:ascii="Times New Roman" w:hAnsi="Times New Roman" w:eastAsia="宋体"/>
@@ -4501,15 +6624,26 @@
         </w:rPr>
         <w:t xml:space="preserve"> Hz) to satisfy the robot’s real-time control requirements. At each control tick, it queries the action buffer for all available predictions corresponding to the current time </w:t>
       </w:r>
-      <w:r>
-        <w:rPr>
-          <w:rFonts w:ascii="Times New Roman" w:hAnsi="Times New Roman" w:eastAsia="宋体"/>
-          <w:b w:val="0"/>
-          <w:i/>
-          <w:sz w:val="24"/>
-        </w:rPr>
-        <w:t>t_{\mathrm{now}}</w:t>
-      </w:r>
+      <m:oMath>
+        <m:sSub>
+          <m:e>
+            <m:r>
+              <m:rPr>
+                <m:sty m:val="i"/>
+              </m:rPr>
+              <m:t xml:space="preserve">t</m:t>
+            </m:r>
+          </m:e>
+          <m:sub>
+            <m:r>
+              <m:rPr>
+                <m:sty m:val="i"/>
+              </m:rPr>
+              <m:t xml:space="preserve">now</m:t>
+            </m:r>
+          </m:sub>
+        </m:sSub>
+      </m:oMath>
       <w:r>
         <w:rPr>
           <w:rFonts w:ascii="Times New Roman" w:hAnsi="Times New Roman" w:eastAsia="宋体"/>
@@ -4519,15 +6653,26 @@
         </w:rPr>
         <w:t xml:space="preserve">. Due to the overlapping nature of action chunks generated by the inference thread, there may be multiple candidate actions for </w:t>
       </w:r>
-      <w:r>
-        <w:rPr>
-          <w:rFonts w:ascii="Times New Roman" w:hAnsi="Times New Roman" w:eastAsia="宋体"/>
-          <w:b w:val="0"/>
-          <w:i/>
-          <w:sz w:val="24"/>
-        </w:rPr>
-        <w:t>t_{\mathrm{now}}</w:t>
-      </w:r>
+      <m:oMath>
+        <m:sSub>
+          <m:e>
+            <m:r>
+              <m:rPr>
+                <m:sty m:val="i"/>
+              </m:rPr>
+              <m:t xml:space="preserve">t</m:t>
+            </m:r>
+          </m:e>
+          <m:sub>
+            <m:r>
+              <m:rPr>
+                <m:sty m:val="i"/>
+              </m:rPr>
+              <m:t xml:space="preserve">now</m:t>
+            </m:r>
+          </m:sub>
+        </m:sSub>
+      </m:oMath>
       <w:r>
         <w:rPr>
           <w:rFonts w:ascii="Times New Roman" w:hAnsi="Times New Roman" w:eastAsia="宋体"/>
@@ -4537,15 +6682,38 @@
         </w:rPr>
         <w:t xml:space="preserve">, denoted as </w:t>
       </w:r>
-      <w:r>
-        <w:rPr>
-          <w:rFonts w:ascii="Times New Roman" w:hAnsi="Times New Roman" w:eastAsia="宋体"/>
-          <w:b w:val="0"/>
-          <w:i/>
-          <w:sz w:val="24"/>
-        </w:rPr>
-        <w:t>A_{t_{\mathrm{now}}}</w:t>
-      </w:r>
+      <m:oMath>
+        <m:sSub>
+          <m:e>
+            <m:r>
+              <m:rPr>
+                <m:sty m:val="i"/>
+              </m:rPr>
+              <m:t xml:space="preserve">A</m:t>
+            </m:r>
+          </m:e>
+          <m:sub>
+            <m:sSub>
+              <m:e>
+                <m:r>
+                  <m:rPr>
+                    <m:sty m:val="i"/>
+                  </m:rPr>
+                  <m:t xml:space="preserve">t</m:t>
+                </m:r>
+              </m:e>
+              <m:sub>
+                <m:r>
+                  <m:rPr>
+                    <m:sty m:val="i"/>
+                  </m:rPr>
+                  <m:t xml:space="preserve">now</m:t>
+                </m:r>
+              </m:sub>
+            </m:sSub>
+          </m:sub>
+        </m:sSub>
+      </m:oMath>
       <w:r>
         <w:rPr>
           <w:rFonts w:ascii="Times New Roman" w:hAnsi="Times New Roman" w:eastAsia="宋体"/>
@@ -4555,15 +6723,26 @@
         </w:rPr>
         <w:t xml:space="preserve">. The final control command </w:t>
       </w:r>
-      <w:r>
-        <w:rPr>
-          <w:rFonts w:ascii="Times New Roman" w:hAnsi="Times New Roman" w:eastAsia="宋体"/>
-          <w:b w:val="0"/>
-          <w:i/>
-          <w:sz w:val="24"/>
-        </w:rPr>
-        <w:t>a_{\mathrm{final}}</w:t>
-      </w:r>
+      <m:oMath>
+        <m:sSub>
+          <m:e>
+            <m:r>
+              <m:rPr>
+                <m:sty m:val="i"/>
+              </m:rPr>
+              <m:t xml:space="preserve">a</m:t>
+            </m:r>
+          </m:e>
+          <m:sub>
+            <m:r>
+              <m:rPr>
+                <m:sty m:val="i"/>
+              </m:rPr>
+              <m:t xml:space="preserve">final</m:t>
+            </m:r>
+          </m:sub>
+        </m:sSub>
+      </m:oMath>
       <w:r>
         <w:rPr>
           <w:rFonts w:ascii="Times New Roman" w:hAnsi="Times New Roman" w:eastAsia="宋体"/>
@@ -4615,15 +6794,44 @@
         </w:rPr>
         <w:t xml:space="preserve"> 以高频运行（如 </w:t>
       </w:r>
-      <w:r>
-        <w:rPr>
-          <w:rFonts w:ascii="Times New Roman" w:hAnsi="Times New Roman" w:eastAsia="宋体"/>
-          <w:b w:val="0"/>
-          <w:i/>
-          <w:sz w:val="24"/>
-        </w:rPr>
-        <w:t>f_c\approx 100</w:t>
-      </w:r>
+      <m:oMath>
+        <m:sSub>
+          <m:e>
+            <m:r>
+              <m:rPr>
+                <m:sty m:val="i"/>
+              </m:rPr>
+              <m:t xml:space="preserve">f</m:t>
+            </m:r>
+          </m:e>
+          <m:sub>
+            <m:r>
+              <m:rPr>
+                <m:sty m:val="i"/>
+              </m:rPr>
+              <m:t xml:space="preserve">c</m:t>
+            </m:r>
+          </m:sub>
+        </m:sSub>
+        <m:r>
+          <m:rPr>
+            <m:sty m:val="p"/>
+          </m:rPr>
+          <m:t xml:space="preserve">≈</m:t>
+        </m:r>
+        <m:r>
+          <m:rPr>
+            <m:sty m:val="p"/>
+          </m:rPr>
+          <m:t xml:space="preserve"> </m:t>
+        </m:r>
+        <m:r>
+          <m:rPr>
+            <m:sty m:val="p"/>
+          </m:rPr>
+          <m:t xml:space="preserve">100</m:t>
+        </m:r>
+      </m:oMath>
       <w:r>
         <w:rPr>
           <w:rFonts w:ascii="Times New Roman" w:hAnsi="Times New Roman" w:eastAsia="宋体"/>
@@ -4633,15 +6841,26 @@
         </w:rPr>
         <w:t xml:space="preserve"> Hz）满足实时控制。每个控制周期查询缓冲中对应当前时刻 </w:t>
       </w:r>
-      <w:r>
-        <w:rPr>
-          <w:rFonts w:ascii="Times New Roman" w:hAnsi="Times New Roman" w:eastAsia="宋体"/>
-          <w:b w:val="0"/>
-          <w:i/>
-          <w:sz w:val="24"/>
-        </w:rPr>
-        <w:t>t_{\mathrm{now}}</w:t>
-      </w:r>
+      <m:oMath>
+        <m:sSub>
+          <m:e>
+            <m:r>
+              <m:rPr>
+                <m:sty m:val="i"/>
+              </m:rPr>
+              <m:t xml:space="preserve">t</m:t>
+            </m:r>
+          </m:e>
+          <m:sub>
+            <m:r>
+              <m:rPr>
+                <m:sty m:val="i"/>
+              </m:rPr>
+              <m:t xml:space="preserve">now</m:t>
+            </m:r>
+          </m:sub>
+        </m:sSub>
+      </m:oMath>
       <w:r>
         <w:rPr>
           <w:rFonts w:ascii="Times New Roman" w:hAnsi="Times New Roman" w:eastAsia="宋体"/>
@@ -4651,15 +6870,26 @@
         </w:rPr>
         <w:t xml:space="preserve"> 的全部可用预测；因推理线程产出的动作块相互重叠，</w:t>
       </w:r>
-      <w:r>
-        <w:rPr>
-          <w:rFonts w:ascii="Times New Roman" w:hAnsi="Times New Roman" w:eastAsia="宋体"/>
-          <w:b w:val="0"/>
-          <w:i/>
-          <w:sz w:val="24"/>
-        </w:rPr>
-        <w:t>t_{\mathrm{now}}</w:t>
-      </w:r>
+      <m:oMath>
+        <m:sSub>
+          <m:e>
+            <m:r>
+              <m:rPr>
+                <m:sty m:val="i"/>
+              </m:rPr>
+              <m:t xml:space="preserve">t</m:t>
+            </m:r>
+          </m:e>
+          <m:sub>
+            <m:r>
+              <m:rPr>
+                <m:sty m:val="i"/>
+              </m:rPr>
+              <m:t xml:space="preserve">now</m:t>
+            </m:r>
+          </m:sub>
+        </m:sSub>
+      </m:oMath>
       <w:r>
         <w:rPr>
           <w:rFonts w:ascii="Times New Roman" w:hAnsi="Times New Roman" w:eastAsia="宋体"/>
@@ -4669,15 +6899,38 @@
         </w:rPr>
         <w:t xml:space="preserve"> 可能有多个候选，记为 </w:t>
       </w:r>
-      <w:r>
-        <w:rPr>
-          <w:rFonts w:ascii="Times New Roman" w:hAnsi="Times New Roman" w:eastAsia="宋体"/>
-          <w:b w:val="0"/>
-          <w:i/>
-          <w:sz w:val="24"/>
-        </w:rPr>
-        <w:t>A_{t_{\mathrm{now}}}</w:t>
-      </w:r>
+      <m:oMath>
+        <m:sSub>
+          <m:e>
+            <m:r>
+              <m:rPr>
+                <m:sty m:val="i"/>
+              </m:rPr>
+              <m:t xml:space="preserve">A</m:t>
+            </m:r>
+          </m:e>
+          <m:sub>
+            <m:sSub>
+              <m:e>
+                <m:r>
+                  <m:rPr>
+                    <m:sty m:val="i"/>
+                  </m:rPr>
+                  <m:t xml:space="preserve">t</m:t>
+                </m:r>
+              </m:e>
+              <m:sub>
+                <m:r>
+                  <m:rPr>
+                    <m:sty m:val="i"/>
+                  </m:rPr>
+                  <m:t xml:space="preserve">now</m:t>
+                </m:r>
+              </m:sub>
+            </m:sSub>
+          </m:sub>
+        </m:sSub>
+      </m:oMath>
       <w:r>
         <w:rPr>
           <w:rFonts w:ascii="Times New Roman" w:hAnsi="Times New Roman" w:eastAsia="宋体"/>
@@ -4687,15 +6940,26 @@
         </w:rPr>
         <w:t xml:space="preserve">。对候选做时序集成得到最终指令 </w:t>
       </w:r>
-      <w:r>
-        <w:rPr>
-          <w:rFonts w:ascii="Times New Roman" w:hAnsi="Times New Roman" w:eastAsia="宋体"/>
-          <w:b w:val="0"/>
-          <w:i/>
-          <w:sz w:val="24"/>
-        </w:rPr>
-        <w:t>a_{\mathrm{final}}</w:t>
-      </w:r>
+      <m:oMath>
+        <m:sSub>
+          <m:e>
+            <m:r>
+              <m:rPr>
+                <m:sty m:val="i"/>
+              </m:rPr>
+              <m:t xml:space="preserve">a</m:t>
+            </m:r>
+          </m:e>
+          <m:sub>
+            <m:r>
+              <m:rPr>
+                <m:sty m:val="i"/>
+              </m:rPr>
+              <m:t xml:space="preserve">final</m:t>
+            </m:r>
+          </m:sub>
+        </m:sSub>
+      </m:oMath>
       <w:r>
         <w:rPr>
           <w:rFonts w:ascii="Times New Roman" w:hAnsi="Times New Roman" w:eastAsia="宋体"/>
@@ -7050,15 +9314,14 @@
         </w:rPr>
         <w:t xml:space="preserve"> 仿真中对视觉遮挡的鲁棒性。成功率随帧遮挡率 </w:t>
       </w:r>
-      <w:r>
-        <w:rPr>
-          <w:rFonts w:ascii="Times New Roman" w:hAnsi="Times New Roman" w:eastAsia="宋体"/>
-          <w:b w:val="0"/>
-          <w:i/>
-          <w:sz w:val="24"/>
-        </w:rPr>
-        <w:t>p</w:t>
-      </w:r>
+      <m:oMath>
+        <m:r>
+          <m:rPr>
+            <m:sty m:val="i"/>
+          </m:rPr>
+          <m:t xml:space="preserve">p</m:t>
+        </m:r>
+      </m:oMath>
       <w:r>
         <w:rPr>
           <w:rFonts w:ascii="Times New Roman" w:hAnsi="Times New Roman" w:eastAsia="宋体"/>
@@ -7690,15 +9953,14 @@
         </w:rPr>
         <w:t xml:space="preserve"> To test the systems’ resilience to real-world visual interruptions, we simulate occlusions by randomly blacking out a certain percentage (</w:t>
       </w:r>
-      <w:r>
-        <w:rPr>
-          <w:rFonts w:ascii="Times New Roman" w:hAnsi="Times New Roman" w:eastAsia="宋体"/>
-          <w:b w:val="0"/>
-          <w:i/>
-          <w:sz w:val="24"/>
-        </w:rPr>
-        <w:t>p</w:t>
-      </w:r>
+      <m:oMath>
+        <m:r>
+          <m:rPr>
+            <m:sty m:val="i"/>
+          </m:rPr>
+          <m:t xml:space="preserve">p</m:t>
+        </m:r>
+      </m:oMath>
       <w:r>
         <w:rPr>
           <w:rFonts w:ascii="Times New Roman" w:hAnsi="Times New Roman" w:eastAsia="宋体"/>
@@ -7732,15 +9994,14 @@
         </w:rPr>
         <w:t xml:space="preserve"> 为测试对真机视觉中断的韧性，我们在推理时随机将输入视频流中比例为 </w:t>
       </w:r>
-      <w:r>
-        <w:rPr>
-          <w:rFonts w:ascii="Times New Roman" w:hAnsi="Times New Roman" w:eastAsia="宋体"/>
-          <w:b w:val="0"/>
-          <w:i/>
-          <w:sz w:val="24"/>
-        </w:rPr>
-        <w:t>p</w:t>
-      </w:r>
+      <m:oMath>
+        <m:r>
+          <m:rPr>
+            <m:sty m:val="i"/>
+          </m:rPr>
+          <m:t xml:space="preserve">p</m:t>
+        </m:r>
+      </m:oMath>
       <w:r>
         <w:rPr>
           <w:rFonts w:ascii="Times New Roman" w:hAnsi="Times New Roman" w:eastAsia="宋体"/>

</xml_diff>